<commit_message>
docs: complete and validate academic diagrams
</commit_message>
<xml_diff>
--- a/docs/RentSphere-Final-Project-Report.docx
+++ b/docs/RentSphere-Final-Project-Report.docx
@@ -1572,7 +1572,7 @@
           <w:u w:val="single"/>
         </w:rPr>
       </w:pPr>
-      <w:bookmarkStart w:id="2" w:name="_Toc238500496"/>
+      <w:bookmarkStart w:id="2" w:name="_Toc238503151"/>
       <w:r>
         <w:rPr>
           <w:rFonts w:eastAsia="Times New Roman"/>
@@ -1674,7 +1674,7 @@
       <w:pPr>
         <w:pStyle w:val="Heading1"/>
       </w:pPr>
-      <w:bookmarkStart w:id="3" w:name="_Toc238500497"/>
+      <w:bookmarkStart w:id="3" w:name="_Toc238503152"/>
       <w:r>
         <w:lastRenderedPageBreak/>
         <w:t>TABLE OF CONTENTS</w:t>
@@ -1727,7 +1727,7 @@
         <w:rPr>
           <w:noProof/>
         </w:rPr>
-        <w:instrText xml:space="preserve"> PAGEREF _Toc238500496 \h </w:instrText>
+        <w:instrText xml:space="preserve"> PAGEREF _Toc238503151 \h </w:instrText>
       </w:r>
       <w:r>
         <w:rPr>
@@ -1789,7 +1789,7 @@
         <w:rPr>
           <w:noProof/>
         </w:rPr>
-        <w:instrText xml:space="preserve"> PAGEREF _Toc238500497 \h </w:instrText>
+        <w:instrText xml:space="preserve"> PAGEREF _Toc238503152 \h </w:instrText>
       </w:r>
       <w:r>
         <w:rPr>
@@ -1851,7 +1851,7 @@
         <w:rPr>
           <w:noProof/>
         </w:rPr>
-        <w:instrText xml:space="preserve"> PAGEREF _Toc238500498 \h </w:instrText>
+        <w:instrText xml:space="preserve"> PAGEREF _Toc238503153 \h </w:instrText>
       </w:r>
       <w:r>
         <w:rPr>
@@ -1913,7 +1913,7 @@
         <w:rPr>
           <w:noProof/>
         </w:rPr>
-        <w:instrText xml:space="preserve"> PAGEREF _Toc238500499 \h </w:instrText>
+        <w:instrText xml:space="preserve"> PAGEREF _Toc238503154 \h </w:instrText>
       </w:r>
       <w:r>
         <w:rPr>
@@ -1971,7 +1971,7 @@
         <w:rPr>
           <w:noProof/>
         </w:rPr>
-        <w:instrText xml:space="preserve"> PAGEREF _Toc238500500 \h </w:instrText>
+        <w:instrText xml:space="preserve"> PAGEREF _Toc238503155 \h </w:instrText>
       </w:r>
       <w:r>
         <w:rPr>
@@ -2029,7 +2029,7 @@
         <w:rPr>
           <w:noProof/>
         </w:rPr>
-        <w:instrText xml:space="preserve"> PAGEREF _Toc238500501 \h </w:instrText>
+        <w:instrText xml:space="preserve"> PAGEREF _Toc238503156 \h </w:instrText>
       </w:r>
       <w:r>
         <w:rPr>
@@ -2087,7 +2087,7 @@
         <w:rPr>
           <w:noProof/>
         </w:rPr>
-        <w:instrText xml:space="preserve"> PAGEREF _Toc238500502 \h </w:instrText>
+        <w:instrText xml:space="preserve"> PAGEREF _Toc238503157 \h </w:instrText>
       </w:r>
       <w:r>
         <w:rPr>
@@ -2149,7 +2149,7 @@
         <w:rPr>
           <w:noProof/>
         </w:rPr>
-        <w:instrText xml:space="preserve"> PAGEREF _Toc238500503 \h </w:instrText>
+        <w:instrText xml:space="preserve"> PAGEREF _Toc238503158 \h </w:instrText>
       </w:r>
       <w:r>
         <w:rPr>
@@ -2207,7 +2207,7 @@
         <w:rPr>
           <w:noProof/>
         </w:rPr>
-        <w:instrText xml:space="preserve"> PAGEREF _Toc238500504 \h </w:instrText>
+        <w:instrText xml:space="preserve"> PAGEREF _Toc238503159 \h </w:instrText>
       </w:r>
       <w:r>
         <w:rPr>
@@ -2265,7 +2265,7 @@
         <w:rPr>
           <w:noProof/>
         </w:rPr>
-        <w:instrText xml:space="preserve"> PAGEREF _Toc238500505 \h </w:instrText>
+        <w:instrText xml:space="preserve"> PAGEREF _Toc238503160 \h </w:instrText>
       </w:r>
       <w:r>
         <w:rPr>
@@ -2323,7 +2323,7 @@
         <w:rPr>
           <w:noProof/>
         </w:rPr>
-        <w:instrText xml:space="preserve"> PAGEREF _Toc238500506 \h </w:instrText>
+        <w:instrText xml:space="preserve"> PAGEREF _Toc238503161 \h </w:instrText>
       </w:r>
       <w:r>
         <w:rPr>
@@ -2381,7 +2381,7 @@
         <w:rPr>
           <w:noProof/>
         </w:rPr>
-        <w:instrText xml:space="preserve"> PAGEREF _Toc238500507 \h </w:instrText>
+        <w:instrText xml:space="preserve"> PAGEREF _Toc238503162 \h </w:instrText>
       </w:r>
       <w:r>
         <w:rPr>
@@ -2439,7 +2439,7 @@
         <w:rPr>
           <w:noProof/>
         </w:rPr>
-        <w:instrText xml:space="preserve"> PAGEREF _Toc238500508 \h </w:instrText>
+        <w:instrText xml:space="preserve"> PAGEREF _Toc238503163 \h </w:instrText>
       </w:r>
       <w:r>
         <w:rPr>
@@ -2497,7 +2497,7 @@
         <w:rPr>
           <w:noProof/>
         </w:rPr>
-        <w:instrText xml:space="preserve"> PAGEREF _Toc238500509 \h </w:instrText>
+        <w:instrText xml:space="preserve"> PAGEREF _Toc238503164 \h </w:instrText>
       </w:r>
       <w:r>
         <w:rPr>
@@ -2514,7 +2514,7 @@
         <w:rPr>
           <w:noProof/>
         </w:rPr>
-        <w:t>19</w:t>
+        <w:t>23</w:t>
       </w:r>
       <w:r>
         <w:rPr>
@@ -2555,7 +2555,7 @@
         <w:rPr>
           <w:noProof/>
         </w:rPr>
-        <w:instrText xml:space="preserve"> PAGEREF _Toc238500510 \h </w:instrText>
+        <w:instrText xml:space="preserve"> PAGEREF _Toc238503165 \h </w:instrText>
       </w:r>
       <w:r>
         <w:rPr>
@@ -2572,7 +2572,7 @@
         <w:rPr>
           <w:noProof/>
         </w:rPr>
-        <w:t>19</w:t>
+        <w:t>23</w:t>
       </w:r>
       <w:r>
         <w:rPr>
@@ -2613,7 +2613,7 @@
         <w:rPr>
           <w:noProof/>
         </w:rPr>
-        <w:instrText xml:space="preserve"> PAGEREF _Toc238500511 \h </w:instrText>
+        <w:instrText xml:space="preserve"> PAGEREF _Toc238503166 \h </w:instrText>
       </w:r>
       <w:r>
         <w:rPr>
@@ -2630,7 +2630,7 @@
         <w:rPr>
           <w:noProof/>
         </w:rPr>
-        <w:t>20</w:t>
+        <w:t>24</w:t>
       </w:r>
       <w:r>
         <w:rPr>
@@ -2671,7 +2671,7 @@
         <w:rPr>
           <w:noProof/>
         </w:rPr>
-        <w:instrText xml:space="preserve"> PAGEREF _Toc238500512 \h </w:instrText>
+        <w:instrText xml:space="preserve"> PAGEREF _Toc238503167 \h </w:instrText>
       </w:r>
       <w:r>
         <w:rPr>
@@ -2688,7 +2688,7 @@
         <w:rPr>
           <w:noProof/>
         </w:rPr>
-        <w:t>20</w:t>
+        <w:t>24</w:t>
       </w:r>
       <w:r>
         <w:rPr>
@@ -2729,7 +2729,7 @@
         <w:rPr>
           <w:noProof/>
         </w:rPr>
-        <w:instrText xml:space="preserve"> PAGEREF _Toc238500513 \h </w:instrText>
+        <w:instrText xml:space="preserve"> PAGEREF _Toc238503168 \h </w:instrText>
       </w:r>
       <w:r>
         <w:rPr>
@@ -2746,7 +2746,7 @@
         <w:rPr>
           <w:noProof/>
         </w:rPr>
-        <w:t>21</w:t>
+        <w:t>25</w:t>
       </w:r>
       <w:r>
         <w:rPr>
@@ -2787,7 +2787,7 @@
         <w:rPr>
           <w:noProof/>
         </w:rPr>
-        <w:instrText xml:space="preserve"> PAGEREF _Toc238500514 \h </w:instrText>
+        <w:instrText xml:space="preserve"> PAGEREF _Toc238503169 \h </w:instrText>
       </w:r>
       <w:r>
         <w:rPr>
@@ -2804,7 +2804,7 @@
         <w:rPr>
           <w:noProof/>
         </w:rPr>
-        <w:t>21</w:t>
+        <w:t>25</w:t>
       </w:r>
       <w:r>
         <w:rPr>
@@ -2845,7 +2845,7 @@
         <w:rPr>
           <w:noProof/>
         </w:rPr>
-        <w:instrText xml:space="preserve"> PAGEREF _Toc238500515 \h </w:instrText>
+        <w:instrText xml:space="preserve"> PAGEREF _Toc238503170 \h </w:instrText>
       </w:r>
       <w:r>
         <w:rPr>
@@ -2862,7 +2862,7 @@
         <w:rPr>
           <w:noProof/>
         </w:rPr>
-        <w:t>22</w:t>
+        <w:t>25</w:t>
       </w:r>
       <w:r>
         <w:rPr>
@@ -2903,7 +2903,7 @@
         <w:rPr>
           <w:noProof/>
         </w:rPr>
-        <w:instrText xml:space="preserve"> PAGEREF _Toc238500516 \h </w:instrText>
+        <w:instrText xml:space="preserve"> PAGEREF _Toc238503171 \h </w:instrText>
       </w:r>
       <w:r>
         <w:rPr>
@@ -2920,7 +2920,7 @@
         <w:rPr>
           <w:noProof/>
         </w:rPr>
-        <w:t>22</w:t>
+        <w:t>26</w:t>
       </w:r>
       <w:r>
         <w:rPr>
@@ -2965,7 +2965,7 @@
         <w:rPr>
           <w:noProof/>
         </w:rPr>
-        <w:instrText xml:space="preserve"> PAGEREF _Toc238500517 \h </w:instrText>
+        <w:instrText xml:space="preserve"> PAGEREF _Toc238503172 \h </w:instrText>
       </w:r>
       <w:r>
         <w:rPr>
@@ -2982,7 +2982,7 @@
         <w:rPr>
           <w:noProof/>
         </w:rPr>
-        <w:t>23</w:t>
+        <w:t>27</w:t>
       </w:r>
       <w:r>
         <w:rPr>
@@ -3023,7 +3023,7 @@
         <w:rPr>
           <w:noProof/>
         </w:rPr>
-        <w:instrText xml:space="preserve"> PAGEREF _Toc238500518 \h </w:instrText>
+        <w:instrText xml:space="preserve"> PAGEREF _Toc238503173 \h </w:instrText>
       </w:r>
       <w:r>
         <w:rPr>
@@ -3040,7 +3040,7 @@
         <w:rPr>
           <w:noProof/>
         </w:rPr>
-        <w:t>23</w:t>
+        <w:t>27</w:t>
       </w:r>
       <w:r>
         <w:rPr>
@@ -3082,7 +3082,7 @@
         <w:rPr>
           <w:noProof/>
         </w:rPr>
-        <w:instrText xml:space="preserve"> PAGEREF _Toc238500519 \h </w:instrText>
+        <w:instrText xml:space="preserve"> PAGEREF _Toc238503174 \h </w:instrText>
       </w:r>
       <w:r>
         <w:rPr>
@@ -3099,7 +3099,7 @@
         <w:rPr>
           <w:noProof/>
         </w:rPr>
-        <w:t>23</w:t>
+        <w:t>27</w:t>
       </w:r>
       <w:r>
         <w:rPr>
@@ -3140,7 +3140,7 @@
         <w:rPr>
           <w:noProof/>
         </w:rPr>
-        <w:instrText xml:space="preserve"> PAGEREF _Toc238500520 \h </w:instrText>
+        <w:instrText xml:space="preserve"> PAGEREF _Toc238503175 \h </w:instrText>
       </w:r>
       <w:r>
         <w:rPr>
@@ -3157,7 +3157,7 @@
         <w:rPr>
           <w:noProof/>
         </w:rPr>
-        <w:t>24</w:t>
+        <w:t>28</w:t>
       </w:r>
       <w:r>
         <w:rPr>
@@ -3198,7 +3198,7 @@
         <w:rPr>
           <w:noProof/>
         </w:rPr>
-        <w:instrText xml:space="preserve"> PAGEREF _Toc238500521 \h </w:instrText>
+        <w:instrText xml:space="preserve"> PAGEREF _Toc238503176 \h </w:instrText>
       </w:r>
       <w:r>
         <w:rPr>
@@ -3215,7 +3215,7 @@
         <w:rPr>
           <w:noProof/>
         </w:rPr>
-        <w:t>24</w:t>
+        <w:t>28</w:t>
       </w:r>
       <w:r>
         <w:rPr>
@@ -3256,7 +3256,7 @@
         <w:rPr>
           <w:noProof/>
         </w:rPr>
-        <w:instrText xml:space="preserve"> PAGEREF _Toc238500522 \h </w:instrText>
+        <w:instrText xml:space="preserve"> PAGEREF _Toc238503177 \h </w:instrText>
       </w:r>
       <w:r>
         <w:rPr>
@@ -3273,7 +3273,7 @@
         <w:rPr>
           <w:noProof/>
         </w:rPr>
-        <w:t>25</w:t>
+        <w:t>30</w:t>
       </w:r>
       <w:r>
         <w:rPr>
@@ -3314,7 +3314,7 @@
         <w:rPr>
           <w:noProof/>
         </w:rPr>
-        <w:instrText xml:space="preserve"> PAGEREF _Toc238500523 \h </w:instrText>
+        <w:instrText xml:space="preserve"> PAGEREF _Toc238503178 \h </w:instrText>
       </w:r>
       <w:r>
         <w:rPr>
@@ -3331,7 +3331,7 @@
         <w:rPr>
           <w:noProof/>
         </w:rPr>
-        <w:t>25</w:t>
+        <w:t>30</w:t>
       </w:r>
       <w:r>
         <w:rPr>
@@ -3372,7 +3372,7 @@
         <w:rPr>
           <w:noProof/>
         </w:rPr>
-        <w:instrText xml:space="preserve"> PAGEREF _Toc238500524 \h </w:instrText>
+        <w:instrText xml:space="preserve"> PAGEREF _Toc238503179 \h </w:instrText>
       </w:r>
       <w:r>
         <w:rPr>
@@ -3389,7 +3389,7 @@
         <w:rPr>
           <w:noProof/>
         </w:rPr>
-        <w:t>30</w:t>
+        <w:t>35</w:t>
       </w:r>
       <w:r>
         <w:rPr>
@@ -3430,7 +3430,7 @@
         <w:rPr>
           <w:noProof/>
         </w:rPr>
-        <w:instrText xml:space="preserve"> PAGEREF _Toc238500525 \h </w:instrText>
+        <w:instrText xml:space="preserve"> PAGEREF _Toc238503180 \h </w:instrText>
       </w:r>
       <w:r>
         <w:rPr>
@@ -3447,7 +3447,7 @@
         <w:rPr>
           <w:noProof/>
         </w:rPr>
-        <w:t>30</w:t>
+        <w:t>35</w:t>
       </w:r>
       <w:r>
         <w:rPr>
@@ -3488,7 +3488,7 @@
         <w:rPr>
           <w:noProof/>
         </w:rPr>
-        <w:instrText xml:space="preserve"> PAGEREF _Toc238500526 \h </w:instrText>
+        <w:instrText xml:space="preserve"> PAGEREF _Toc238503181 \h </w:instrText>
       </w:r>
       <w:r>
         <w:rPr>
@@ -3505,7 +3505,7 @@
         <w:rPr>
           <w:noProof/>
         </w:rPr>
-        <w:t>31</w:t>
+        <w:t>36</w:t>
       </w:r>
       <w:r>
         <w:rPr>
@@ -3546,7 +3546,7 @@
         <w:rPr>
           <w:noProof/>
         </w:rPr>
-        <w:instrText xml:space="preserve"> PAGEREF _Toc238500527 \h </w:instrText>
+        <w:instrText xml:space="preserve"> PAGEREF _Toc238503182 \h </w:instrText>
       </w:r>
       <w:r>
         <w:rPr>
@@ -3563,7 +3563,7 @@
         <w:rPr>
           <w:noProof/>
         </w:rPr>
-        <w:t>31</w:t>
+        <w:t>36</w:t>
       </w:r>
       <w:r>
         <w:rPr>
@@ -3604,7 +3604,7 @@
         <w:rPr>
           <w:noProof/>
         </w:rPr>
-        <w:instrText xml:space="preserve"> PAGEREF _Toc238500528 \h </w:instrText>
+        <w:instrText xml:space="preserve"> PAGEREF _Toc238503183 \h </w:instrText>
       </w:r>
       <w:r>
         <w:rPr>
@@ -3621,7 +3621,7 @@
         <w:rPr>
           <w:noProof/>
         </w:rPr>
-        <w:t>31</w:t>
+        <w:t>36</w:t>
       </w:r>
       <w:r>
         <w:rPr>
@@ -3662,7 +3662,7 @@
         <w:rPr>
           <w:noProof/>
         </w:rPr>
-        <w:instrText xml:space="preserve"> PAGEREF _Toc238500529 \h </w:instrText>
+        <w:instrText xml:space="preserve"> PAGEREF _Toc238503184 \h </w:instrText>
       </w:r>
       <w:r>
         <w:rPr>
@@ -3679,7 +3679,7 @@
         <w:rPr>
           <w:noProof/>
         </w:rPr>
-        <w:t>32</w:t>
+        <w:t>37</w:t>
       </w:r>
       <w:r>
         <w:rPr>
@@ -3724,7 +3724,7 @@
         <w:rPr>
           <w:noProof/>
         </w:rPr>
-        <w:instrText xml:space="preserve"> PAGEREF _Toc238500530 \h </w:instrText>
+        <w:instrText xml:space="preserve"> PAGEREF _Toc238503185 \h </w:instrText>
       </w:r>
       <w:r>
         <w:rPr>
@@ -3741,7 +3741,7 @@
         <w:rPr>
           <w:noProof/>
         </w:rPr>
-        <w:t>33</w:t>
+        <w:t>38</w:t>
       </w:r>
       <w:r>
         <w:rPr>
@@ -3782,7 +3782,7 @@
         <w:rPr>
           <w:noProof/>
         </w:rPr>
-        <w:instrText xml:space="preserve"> PAGEREF _Toc238500531 \h </w:instrText>
+        <w:instrText xml:space="preserve"> PAGEREF _Toc238503186 \h </w:instrText>
       </w:r>
       <w:r>
         <w:rPr>
@@ -3799,7 +3799,7 @@
         <w:rPr>
           <w:noProof/>
         </w:rPr>
-        <w:t>33</w:t>
+        <w:t>38</w:t>
       </w:r>
       <w:r>
         <w:rPr>
@@ -3840,7 +3840,7 @@
         <w:rPr>
           <w:noProof/>
         </w:rPr>
-        <w:instrText xml:space="preserve"> PAGEREF _Toc238500532 \h </w:instrText>
+        <w:instrText xml:space="preserve"> PAGEREF _Toc238503187 \h </w:instrText>
       </w:r>
       <w:r>
         <w:rPr>
@@ -3857,7 +3857,7 @@
         <w:rPr>
           <w:noProof/>
         </w:rPr>
-        <w:t>33</w:t>
+        <w:t>38</w:t>
       </w:r>
       <w:r>
         <w:rPr>
@@ -3898,7 +3898,7 @@
         <w:rPr>
           <w:noProof/>
         </w:rPr>
-        <w:instrText xml:space="preserve"> PAGEREF _Toc238500533 \h </w:instrText>
+        <w:instrText xml:space="preserve"> PAGEREF _Toc238503188 \h </w:instrText>
       </w:r>
       <w:r>
         <w:rPr>
@@ -3915,7 +3915,7 @@
         <w:rPr>
           <w:noProof/>
         </w:rPr>
-        <w:t>33</w:t>
+        <w:t>38</w:t>
       </w:r>
       <w:r>
         <w:rPr>
@@ -3956,7 +3956,7 @@
         <w:rPr>
           <w:noProof/>
         </w:rPr>
-        <w:instrText xml:space="preserve"> PAGEREF _Toc238500534 \h </w:instrText>
+        <w:instrText xml:space="preserve"> PAGEREF _Toc238503189 \h </w:instrText>
       </w:r>
       <w:r>
         <w:rPr>
@@ -3973,7 +3973,7 @@
         <w:rPr>
           <w:noProof/>
         </w:rPr>
-        <w:t>33</w:t>
+        <w:t>38</w:t>
       </w:r>
       <w:r>
         <w:rPr>
@@ -4014,7 +4014,7 @@
         <w:rPr>
           <w:noProof/>
         </w:rPr>
-        <w:instrText xml:space="preserve"> PAGEREF _Toc238500535 \h </w:instrText>
+        <w:instrText xml:space="preserve"> PAGEREF _Toc238503190 \h </w:instrText>
       </w:r>
       <w:r>
         <w:rPr>
@@ -4031,7 +4031,7 @@
         <w:rPr>
           <w:noProof/>
         </w:rPr>
-        <w:t>33</w:t>
+        <w:t>38</w:t>
       </w:r>
       <w:r>
         <w:rPr>
@@ -4072,7 +4072,7 @@
         <w:rPr>
           <w:noProof/>
         </w:rPr>
-        <w:instrText xml:space="preserve"> PAGEREF _Toc238500536 \h </w:instrText>
+        <w:instrText xml:space="preserve"> PAGEREF _Toc238503191 \h </w:instrText>
       </w:r>
       <w:r>
         <w:rPr>
@@ -4089,7 +4089,7 @@
         <w:rPr>
           <w:noProof/>
         </w:rPr>
-        <w:t>33</w:t>
+        <w:t>38</w:t>
       </w:r>
       <w:r>
         <w:rPr>
@@ -4130,7 +4130,7 @@
         <w:rPr>
           <w:noProof/>
         </w:rPr>
-        <w:instrText xml:space="preserve"> PAGEREF _Toc238500537 \h </w:instrText>
+        <w:instrText xml:space="preserve"> PAGEREF _Toc238503192 \h </w:instrText>
       </w:r>
       <w:r>
         <w:rPr>
@@ -4147,7 +4147,7 @@
         <w:rPr>
           <w:noProof/>
         </w:rPr>
-        <w:t>34</w:t>
+        <w:t>39</w:t>
       </w:r>
       <w:r>
         <w:rPr>
@@ -4188,7 +4188,7 @@
         <w:rPr>
           <w:noProof/>
         </w:rPr>
-        <w:instrText xml:space="preserve"> PAGEREF _Toc238500538 \h </w:instrText>
+        <w:instrText xml:space="preserve"> PAGEREF _Toc238503193 \h </w:instrText>
       </w:r>
       <w:r>
         <w:rPr>
@@ -4205,7 +4205,7 @@
         <w:rPr>
           <w:noProof/>
         </w:rPr>
-        <w:t>34</w:t>
+        <w:t>39</w:t>
       </w:r>
       <w:r>
         <w:rPr>
@@ -4246,7 +4246,7 @@
         <w:rPr>
           <w:noProof/>
         </w:rPr>
-        <w:instrText xml:space="preserve"> PAGEREF _Toc238500539 \h </w:instrText>
+        <w:instrText xml:space="preserve"> PAGEREF _Toc238503194 \h </w:instrText>
       </w:r>
       <w:r>
         <w:rPr>
@@ -4263,7 +4263,7 @@
         <w:rPr>
           <w:noProof/>
         </w:rPr>
-        <w:t>34</w:t>
+        <w:t>39</w:t>
       </w:r>
       <w:r>
         <w:rPr>
@@ -4304,7 +4304,7 @@
         <w:rPr>
           <w:noProof/>
         </w:rPr>
-        <w:instrText xml:space="preserve"> PAGEREF _Toc238500540 \h </w:instrText>
+        <w:instrText xml:space="preserve"> PAGEREF _Toc238503195 \h </w:instrText>
       </w:r>
       <w:r>
         <w:rPr>
@@ -4321,7 +4321,7 @@
         <w:rPr>
           <w:noProof/>
         </w:rPr>
-        <w:t>34</w:t>
+        <w:t>39</w:t>
       </w:r>
       <w:r>
         <w:rPr>
@@ -4362,7 +4362,7 @@
         <w:rPr>
           <w:noProof/>
         </w:rPr>
-        <w:instrText xml:space="preserve"> PAGEREF _Toc238500541 \h </w:instrText>
+        <w:instrText xml:space="preserve"> PAGEREF _Toc238503196 \h </w:instrText>
       </w:r>
       <w:r>
         <w:rPr>
@@ -4379,7 +4379,7 @@
         <w:rPr>
           <w:noProof/>
         </w:rPr>
-        <w:t>34</w:t>
+        <w:t>39</w:t>
       </w:r>
       <w:r>
         <w:rPr>
@@ -4420,7 +4420,7 @@
         <w:rPr>
           <w:noProof/>
         </w:rPr>
-        <w:instrText xml:space="preserve"> PAGEREF _Toc238500542 \h </w:instrText>
+        <w:instrText xml:space="preserve"> PAGEREF _Toc238503197 \h </w:instrText>
       </w:r>
       <w:r>
         <w:rPr>
@@ -4437,7 +4437,7 @@
         <w:rPr>
           <w:noProof/>
         </w:rPr>
-        <w:t>34</w:t>
+        <w:t>39</w:t>
       </w:r>
       <w:r>
         <w:rPr>
@@ -4478,7 +4478,7 @@
         <w:rPr>
           <w:noProof/>
         </w:rPr>
-        <w:instrText xml:space="preserve"> PAGEREF _Toc238500543 \h </w:instrText>
+        <w:instrText xml:space="preserve"> PAGEREF _Toc238503198 \h </w:instrText>
       </w:r>
       <w:r>
         <w:rPr>
@@ -4495,7 +4495,7 @@
         <w:rPr>
           <w:noProof/>
         </w:rPr>
-        <w:t>35</w:t>
+        <w:t>40</w:t>
       </w:r>
       <w:r>
         <w:rPr>
@@ -4537,7 +4537,7 @@
         <w:rPr>
           <w:noProof/>
         </w:rPr>
-        <w:instrText xml:space="preserve"> PAGEREF _Toc238500544 \h </w:instrText>
+        <w:instrText xml:space="preserve"> PAGEREF _Toc238503199 \h </w:instrText>
       </w:r>
       <w:r>
         <w:rPr>
@@ -4554,7 +4554,7 @@
         <w:rPr>
           <w:noProof/>
         </w:rPr>
-        <w:t>35</w:t>
+        <w:t>40</w:t>
       </w:r>
       <w:r>
         <w:rPr>
@@ -4599,7 +4599,7 @@
         <w:rPr>
           <w:noProof/>
         </w:rPr>
-        <w:instrText xml:space="preserve"> PAGEREF _Toc238500545 \h </w:instrText>
+        <w:instrText xml:space="preserve"> PAGEREF _Toc238503200 \h </w:instrText>
       </w:r>
       <w:r>
         <w:rPr>
@@ -4616,7 +4616,7 @@
         <w:rPr>
           <w:noProof/>
         </w:rPr>
-        <w:t>37</w:t>
+        <w:t>42</w:t>
       </w:r>
       <w:r>
         <w:rPr>
@@ -4657,7 +4657,7 @@
         <w:rPr>
           <w:noProof/>
         </w:rPr>
-        <w:instrText xml:space="preserve"> PAGEREF _Toc238500546 \h </w:instrText>
+        <w:instrText xml:space="preserve"> PAGEREF _Toc238503201 \h </w:instrText>
       </w:r>
       <w:r>
         <w:rPr>
@@ -4674,7 +4674,7 @@
         <w:rPr>
           <w:noProof/>
         </w:rPr>
-        <w:t>37</w:t>
+        <w:t>42</w:t>
       </w:r>
       <w:r>
         <w:rPr>
@@ -4715,7 +4715,7 @@
         <w:rPr>
           <w:noProof/>
         </w:rPr>
-        <w:instrText xml:space="preserve"> PAGEREF _Toc238500547 \h </w:instrText>
+        <w:instrText xml:space="preserve"> PAGEREF _Toc238503202 \h </w:instrText>
       </w:r>
       <w:r>
         <w:rPr>
@@ -4732,7 +4732,7 @@
         <w:rPr>
           <w:noProof/>
         </w:rPr>
-        <w:t>37</w:t>
+        <w:t>42</w:t>
       </w:r>
       <w:r>
         <w:rPr>
@@ -4773,7 +4773,7 @@
         <w:rPr>
           <w:noProof/>
         </w:rPr>
-        <w:instrText xml:space="preserve"> PAGEREF _Toc238500548 \h </w:instrText>
+        <w:instrText xml:space="preserve"> PAGEREF _Toc238503203 \h </w:instrText>
       </w:r>
       <w:r>
         <w:rPr>
@@ -4790,7 +4790,7 @@
         <w:rPr>
           <w:noProof/>
         </w:rPr>
-        <w:t>38</w:t>
+        <w:t>43</w:t>
       </w:r>
       <w:r>
         <w:rPr>
@@ -4831,7 +4831,7 @@
         <w:rPr>
           <w:noProof/>
         </w:rPr>
-        <w:instrText xml:space="preserve"> PAGEREF _Toc238500549 \h </w:instrText>
+        <w:instrText xml:space="preserve"> PAGEREF _Toc238503204 \h </w:instrText>
       </w:r>
       <w:r>
         <w:rPr>
@@ -4848,7 +4848,7 @@
         <w:rPr>
           <w:noProof/>
         </w:rPr>
-        <w:t>39</w:t>
+        <w:t>44</w:t>
       </w:r>
       <w:r>
         <w:rPr>
@@ -4889,7 +4889,7 @@
         <w:rPr>
           <w:noProof/>
         </w:rPr>
-        <w:instrText xml:space="preserve"> PAGEREF _Toc238500550 \h </w:instrText>
+        <w:instrText xml:space="preserve"> PAGEREF _Toc238503205 \h </w:instrText>
       </w:r>
       <w:r>
         <w:rPr>
@@ -4906,7 +4906,7 @@
         <w:rPr>
           <w:noProof/>
         </w:rPr>
-        <w:t>39</w:t>
+        <w:t>44</w:t>
       </w:r>
       <w:r>
         <w:rPr>
@@ -4947,7 +4947,7 @@
         <w:rPr>
           <w:noProof/>
         </w:rPr>
-        <w:instrText xml:space="preserve"> PAGEREF _Toc238500551 \h </w:instrText>
+        <w:instrText xml:space="preserve"> PAGEREF _Toc238503206 \h </w:instrText>
       </w:r>
       <w:r>
         <w:rPr>
@@ -4964,7 +4964,7 @@
         <w:rPr>
           <w:noProof/>
         </w:rPr>
-        <w:t>39</w:t>
+        <w:t>44</w:t>
       </w:r>
       <w:r>
         <w:rPr>
@@ -5009,7 +5009,7 @@
         <w:rPr>
           <w:noProof/>
         </w:rPr>
-        <w:instrText xml:space="preserve"> PAGEREF _Toc238500552 \h </w:instrText>
+        <w:instrText xml:space="preserve"> PAGEREF _Toc238503207 \h </w:instrText>
       </w:r>
       <w:r>
         <w:rPr>
@@ -5026,7 +5026,7 @@
         <w:rPr>
           <w:noProof/>
         </w:rPr>
-        <w:t>41</w:t>
+        <w:t>46</w:t>
       </w:r>
       <w:r>
         <w:rPr>
@@ -5067,7 +5067,7 @@
         <w:rPr>
           <w:noProof/>
         </w:rPr>
-        <w:instrText xml:space="preserve"> PAGEREF _Toc238500553 \h </w:instrText>
+        <w:instrText xml:space="preserve"> PAGEREF _Toc238503208 \h </w:instrText>
       </w:r>
       <w:r>
         <w:rPr>
@@ -5084,7 +5084,7 @@
         <w:rPr>
           <w:noProof/>
         </w:rPr>
-        <w:t>41</w:t>
+        <w:t>46</w:t>
       </w:r>
       <w:r>
         <w:rPr>
@@ -5125,7 +5125,7 @@
         <w:rPr>
           <w:noProof/>
         </w:rPr>
-        <w:instrText xml:space="preserve"> PAGEREF _Toc238500554 \h </w:instrText>
+        <w:instrText xml:space="preserve"> PAGEREF _Toc238503209 \h </w:instrText>
       </w:r>
       <w:r>
         <w:rPr>
@@ -5142,7 +5142,7 @@
         <w:rPr>
           <w:noProof/>
         </w:rPr>
-        <w:t>41</w:t>
+        <w:t>46</w:t>
       </w:r>
       <w:r>
         <w:rPr>
@@ -5183,7 +5183,7 @@
         <w:rPr>
           <w:noProof/>
         </w:rPr>
-        <w:instrText xml:space="preserve"> PAGEREF _Toc238500555 \h </w:instrText>
+        <w:instrText xml:space="preserve"> PAGEREF _Toc238503210 \h </w:instrText>
       </w:r>
       <w:r>
         <w:rPr>
@@ -5200,7 +5200,7 @@
         <w:rPr>
           <w:noProof/>
         </w:rPr>
-        <w:t>41</w:t>
+        <w:t>46</w:t>
       </w:r>
       <w:r>
         <w:rPr>
@@ -5241,7 +5241,7 @@
         <w:rPr>
           <w:noProof/>
         </w:rPr>
-        <w:instrText xml:space="preserve"> PAGEREF _Toc238500556 \h </w:instrText>
+        <w:instrText xml:space="preserve"> PAGEREF _Toc238503211 \h </w:instrText>
       </w:r>
       <w:r>
         <w:rPr>
@@ -5258,7 +5258,7 @@
         <w:rPr>
           <w:noProof/>
         </w:rPr>
-        <w:t>42</w:t>
+        <w:t>47</w:t>
       </w:r>
       <w:r>
         <w:rPr>
@@ -5299,7 +5299,7 @@
         <w:rPr>
           <w:noProof/>
         </w:rPr>
-        <w:instrText xml:space="preserve"> PAGEREF _Toc238500557 \h </w:instrText>
+        <w:instrText xml:space="preserve"> PAGEREF _Toc238503212 \h </w:instrText>
       </w:r>
       <w:r>
         <w:rPr>
@@ -5316,7 +5316,7 @@
         <w:rPr>
           <w:noProof/>
         </w:rPr>
-        <w:t>42</w:t>
+        <w:t>47</w:t>
       </w:r>
       <w:r>
         <w:rPr>
@@ -5361,7 +5361,7 @@
         <w:rPr>
           <w:noProof/>
         </w:rPr>
-        <w:instrText xml:space="preserve"> PAGEREF _Toc238500558 \h </w:instrText>
+        <w:instrText xml:space="preserve"> PAGEREF _Toc238503213 \h </w:instrText>
       </w:r>
       <w:r>
         <w:rPr>
@@ -5378,7 +5378,7 @@
         <w:rPr>
           <w:noProof/>
         </w:rPr>
-        <w:t>43</w:t>
+        <w:t>48</w:t>
       </w:r>
       <w:r>
         <w:rPr>
@@ -5419,7 +5419,7 @@
         <w:rPr>
           <w:noProof/>
         </w:rPr>
-        <w:instrText xml:space="preserve"> PAGEREF _Toc238500559 \h </w:instrText>
+        <w:instrText xml:space="preserve"> PAGEREF _Toc238503214 \h </w:instrText>
       </w:r>
       <w:r>
         <w:rPr>
@@ -5436,7 +5436,7 @@
         <w:rPr>
           <w:noProof/>
         </w:rPr>
-        <w:t>43</w:t>
+        <w:t>48</w:t>
       </w:r>
       <w:r>
         <w:rPr>
@@ -5473,7 +5473,7 @@
       <w:pPr>
         <w:pStyle w:val="Heading1"/>
       </w:pPr>
-      <w:bookmarkStart w:id="4" w:name="_Toc238500498"/>
+      <w:bookmarkStart w:id="4" w:name="_Toc238503153"/>
       <w:r>
         <w:lastRenderedPageBreak/>
         <w:t>1. ABSTRACT</w:t>
@@ -5513,7 +5513,7 @@
       <w:pPr>
         <w:pStyle w:val="Heading1"/>
       </w:pPr>
-      <w:bookmarkStart w:id="5" w:name="_Toc238500499"/>
+      <w:bookmarkStart w:id="5" w:name="_Toc238503154"/>
       <w:r>
         <w:lastRenderedPageBreak/>
         <w:t>2. PROBLEM DEFINITION</w:t>
@@ -5539,7 +5539,7 @@
       <w:pPr>
         <w:pStyle w:val="Heading2"/>
       </w:pPr>
-      <w:bookmarkStart w:id="6" w:name="_Toc238500500"/>
+      <w:bookmarkStart w:id="6" w:name="_Toc238503155"/>
       <w:r>
         <w:t>2.1 Objective</w:t>
       </w:r>
@@ -5651,7 +5651,7 @@
       <w:pPr>
         <w:pStyle w:val="Heading2"/>
       </w:pPr>
-      <w:bookmarkStart w:id="7" w:name="_Toc238500501"/>
+      <w:bookmarkStart w:id="7" w:name="_Toc238503156"/>
       <w:r>
         <w:t>2.2 Advantages of the Proposed System</w:t>
       </w:r>
@@ -5757,7 +5757,7 @@
       <w:pPr>
         <w:pStyle w:val="Heading2"/>
       </w:pPr>
-      <w:bookmarkStart w:id="8" w:name="_Toc238500502"/>
+      <w:bookmarkStart w:id="8" w:name="_Toc238503157"/>
       <w:r>
         <w:t>2.3 Limitations: Scope and Boundary</w:t>
       </w:r>
@@ -5862,7 +5862,7 @@
       <w:pPr>
         <w:pStyle w:val="Heading1"/>
       </w:pPr>
-      <w:bookmarkStart w:id="9" w:name="_Toc238500503"/>
+      <w:bookmarkStart w:id="9" w:name="_Toc238503158"/>
       <w:r>
         <w:lastRenderedPageBreak/>
         <w:t>3. REQUIREMENT ANALYSIS</w:t>
@@ -5907,7 +5907,7 @@
       <w:pPr>
         <w:pStyle w:val="Heading2"/>
       </w:pPr>
-      <w:bookmarkStart w:id="10" w:name="_Toc238500504"/>
+      <w:bookmarkStart w:id="10" w:name="_Toc238503159"/>
       <w:r>
         <w:t>3.1 Data Flow Diagram</w:t>
       </w:r>
@@ -5917,7 +5917,7 @@
       <w:pPr>
         <w:pStyle w:val="Heading3"/>
       </w:pPr>
-      <w:bookmarkStart w:id="11" w:name="_Toc238500505"/>
+      <w:bookmarkStart w:id="11" w:name="_Toc238503160"/>
       <w:r>
         <w:t>Level 0: Context Diagram</w:t>
       </w:r>
@@ -5932,10 +5932,10 @@
           <w:noProof/>
         </w:rPr>
         <w:drawing>
-          <wp:inline distT="0" distB="0" distL="0" distR="0" wp14:anchorId="72F2ED71" wp14:editId="36DE0CE8">
+          <wp:inline distT="0" distB="0" distL="0" distR="0" wp14:anchorId="343CD30F" wp14:editId="7CD049BD">
             <wp:extent cx="5943600" cy="3714750"/>
             <wp:effectExtent l="0" t="0" r="0" b="0"/>
-            <wp:docPr id="1861207185" name="Picture 1"/>
+            <wp:docPr id="832673195" name="Picture 1"/>
             <wp:cNvGraphicFramePr>
               <a:graphicFrameLocks xmlns:a="http://schemas.openxmlformats.org/drawingml/2006/main" noChangeAspect="1"/>
             </wp:cNvGraphicFramePr>
@@ -5943,7 +5943,7 @@
               <a:graphicData uri="http://schemas.openxmlformats.org/drawingml/2006/picture">
                 <pic:pic xmlns:pic="http://schemas.openxmlformats.org/drawingml/2006/picture">
                   <pic:nvPicPr>
-                    <pic:cNvPr id="1861207185" name=""/>
+                    <pic:cNvPr id="832673195" name=""/>
                     <pic:cNvPicPr/>
                   </pic:nvPicPr>
                   <pic:blipFill>
@@ -5992,7 +5992,7 @@
       <w:pPr>
         <w:pStyle w:val="Heading3"/>
       </w:pPr>
-      <w:bookmarkStart w:id="12" w:name="_Toc238500506"/>
+      <w:bookmarkStart w:id="12" w:name="_Toc238503161"/>
       <w:r>
         <w:lastRenderedPageBreak/>
         <w:t>Level 1: Major Processes</w:t>
@@ -6008,10 +6008,10 @@
           <w:noProof/>
         </w:rPr>
         <w:drawing>
-          <wp:inline distT="0" distB="0" distL="0" distR="0" wp14:anchorId="7B79A5EE" wp14:editId="2E52BB09">
+          <wp:inline distT="0" distB="0" distL="0" distR="0" wp14:anchorId="08EA54D7" wp14:editId="7CA26381">
             <wp:extent cx="5943600" cy="3714750"/>
             <wp:effectExtent l="0" t="0" r="0" b="0"/>
-            <wp:docPr id="855946901" name="Picture 2"/>
+            <wp:docPr id="287229885" name="Picture 2"/>
             <wp:cNvGraphicFramePr>
               <a:graphicFrameLocks xmlns:a="http://schemas.openxmlformats.org/drawingml/2006/main" noChangeAspect="1"/>
             </wp:cNvGraphicFramePr>
@@ -6019,7 +6019,7 @@
               <a:graphicData uri="http://schemas.openxmlformats.org/drawingml/2006/picture">
                 <pic:pic xmlns:pic="http://schemas.openxmlformats.org/drawingml/2006/picture">
                   <pic:nvPicPr>
-                    <pic:cNvPr id="855946901" name=""/>
+                    <pic:cNvPr id="287229885" name=""/>
                     <pic:cNvPicPr/>
                   </pic:nvPicPr>
                   <pic:blipFill>
@@ -6068,7 +6068,7 @@
       <w:pPr>
         <w:pStyle w:val="Heading3"/>
       </w:pPr>
-      <w:bookmarkStart w:id="13" w:name="_Toc238500507"/>
+      <w:bookmarkStart w:id="13" w:name="_Toc238503162"/>
       <w:r>
         <w:lastRenderedPageBreak/>
         <w:t>Level 2: Payment Process</w:t>
@@ -6084,10 +6084,10 @@
           <w:noProof/>
         </w:rPr>
         <w:drawing>
-          <wp:inline distT="0" distB="0" distL="0" distR="0" wp14:anchorId="44CE5E8A" wp14:editId="01B8EC6D">
+          <wp:inline distT="0" distB="0" distL="0" distR="0" wp14:anchorId="59F5E672" wp14:editId="2307C878">
             <wp:extent cx="5943600" cy="3714750"/>
             <wp:effectExtent l="0" t="0" r="0" b="0"/>
-            <wp:docPr id="1391743905" name="Picture 3"/>
+            <wp:docPr id="749802155" name="Picture 3"/>
             <wp:cNvGraphicFramePr>
               <a:graphicFrameLocks xmlns:a="http://schemas.openxmlformats.org/drawingml/2006/main" noChangeAspect="1"/>
             </wp:cNvGraphicFramePr>
@@ -6095,7 +6095,7 @@
               <a:graphicData uri="http://schemas.openxmlformats.org/drawingml/2006/picture">
                 <pic:pic xmlns:pic="http://schemas.openxmlformats.org/drawingml/2006/picture">
                   <pic:nvPicPr>
-                    <pic:cNvPr id="1391743905" name=""/>
+                    <pic:cNvPr id="749802155" name=""/>
                     <pic:cNvPicPr/>
                   </pic:nvPicPr>
                   <pic:blipFill>
@@ -6144,7 +6144,7 @@
       <w:pPr>
         <w:pStyle w:val="Heading2"/>
       </w:pPr>
-      <w:bookmarkStart w:id="14" w:name="_Toc238500508"/>
+      <w:bookmarkStart w:id="14" w:name="_Toc238503163"/>
       <w:r>
         <w:lastRenderedPageBreak/>
         <w:t>3.2 ER Diagram</w:t>
@@ -6160,10 +6160,10 @@
           <w:noProof/>
         </w:rPr>
         <w:drawing>
-          <wp:inline distT="0" distB="0" distL="0" distR="0" wp14:anchorId="0372CD8C" wp14:editId="0394E244">
+          <wp:inline distT="0" distB="0" distL="0" distR="0" wp14:anchorId="2CE9983F" wp14:editId="23D44FD8">
             <wp:extent cx="5943600" cy="3714750"/>
             <wp:effectExtent l="0" t="0" r="0" b="0"/>
-            <wp:docPr id="393050034" name="Picture 4"/>
+            <wp:docPr id="902448097" name="Picture 4"/>
             <wp:cNvGraphicFramePr>
               <a:graphicFrameLocks xmlns:a="http://schemas.openxmlformats.org/drawingml/2006/main" noChangeAspect="1"/>
             </wp:cNvGraphicFramePr>
@@ -6171,7 +6171,7 @@
               <a:graphicData uri="http://schemas.openxmlformats.org/drawingml/2006/picture">
                 <pic:pic xmlns:pic="http://schemas.openxmlformats.org/drawingml/2006/picture">
                   <pic:nvPicPr>
-                    <pic:cNvPr id="393050034" name=""/>
+                    <pic:cNvPr id="902448097" name=""/>
                     <pic:cNvPicPr/>
                   </pic:nvPicPr>
                   <pic:blipFill>
@@ -6218,9 +6218,309 @@
     </w:p>
     <w:p>
       <w:pPr>
+        <w:spacing w:after="160" w:line="259" w:lineRule="auto"/>
+        <w:jc w:val="left"/>
+      </w:pPr>
+      <w:r>
+        <w:br w:type="page"/>
+      </w:r>
+    </w:p>
+    <w:p>
+      <w:pPr>
+        <w:jc w:val="center"/>
+      </w:pPr>
+      <w:r>
+        <w:rPr>
+          <w:noProof/>
+        </w:rPr>
+        <w:lastRenderedPageBreak/>
+        <w:drawing>
+          <wp:inline distT="0" distB="0" distL="0" distR="0" wp14:anchorId="1AEFE018" wp14:editId="3B50BFA1">
+            <wp:extent cx="5943600" cy="6443980"/>
+            <wp:effectExtent l="0" t="0" r="0" b="0"/>
+            <wp:docPr id="132009711" name="Picture 5"/>
+            <wp:cNvGraphicFramePr>
+              <a:graphicFrameLocks xmlns:a="http://schemas.openxmlformats.org/drawingml/2006/main" noChangeAspect="1"/>
+            </wp:cNvGraphicFramePr>
+            <a:graphic xmlns:a="http://schemas.openxmlformats.org/drawingml/2006/main">
+              <a:graphicData uri="http://schemas.openxmlformats.org/drawingml/2006/picture">
+                <pic:pic xmlns:pic="http://schemas.openxmlformats.org/drawingml/2006/picture">
+                  <pic:nvPicPr>
+                    <pic:cNvPr id="132009711" name=""/>
+                    <pic:cNvPicPr/>
+                  </pic:nvPicPr>
+                  <pic:blipFill>
+                    <a:blip r:embed="rId19" cstate="print">
+                      <a:extLst>
+                        <a:ext uri="{28A0092B-C50C-407E-A947-70E740481C1C}">
+                          <a14:useLocalDpi xmlns:a14="http://schemas.microsoft.com/office/drawing/2010/main" val="0"/>
+                        </a:ext>
+                      </a:extLst>
+                    </a:blip>
+                    <a:stretch>
+                      <a:fillRect/>
+                    </a:stretch>
+                  </pic:blipFill>
+                  <pic:spPr>
+                    <a:xfrm>
+                      <a:off x="0" y="0"/>
+                      <a:ext cx="5943600" cy="6443980"/>
+                    </a:xfrm>
+                    <a:prstGeom prst="rect">
+                      <a:avLst/>
+                    </a:prstGeom>
+                  </pic:spPr>
+                </pic:pic>
+              </a:graphicData>
+            </a:graphic>
+          </wp:inline>
+        </w:drawing>
+      </w:r>
+    </w:p>
+    <w:p>
+      <w:pPr>
+        <w:pStyle w:val="Caption"/>
+        <w:rPr>
+          <w:sz w:val="20"/>
+        </w:rPr>
+      </w:pPr>
+      <w:r>
+        <w:rPr>
+          <w:sz w:val="20"/>
+        </w:rPr>
+        <w:t>Figure 3.5 - ER Attributes: Portfolio and Identity</w:t>
+      </w:r>
+    </w:p>
+    <w:p>
+      <w:pPr>
+        <w:spacing w:after="160" w:line="259" w:lineRule="auto"/>
+        <w:jc w:val="left"/>
+      </w:pPr>
+      <w:r>
+        <w:br w:type="page"/>
+      </w:r>
+    </w:p>
+    <w:p>
+      <w:pPr>
+        <w:jc w:val="center"/>
+      </w:pPr>
+      <w:r>
+        <w:rPr>
+          <w:noProof/>
+        </w:rPr>
+        <w:lastRenderedPageBreak/>
+        <w:drawing>
+          <wp:inline distT="0" distB="0" distL="0" distR="0" wp14:anchorId="288BF051" wp14:editId="6BEE982C">
+            <wp:extent cx="5943600" cy="5272405"/>
+            <wp:effectExtent l="0" t="0" r="0" b="4445"/>
+            <wp:docPr id="709296657" name="Picture 6"/>
+            <wp:cNvGraphicFramePr>
+              <a:graphicFrameLocks xmlns:a="http://schemas.openxmlformats.org/drawingml/2006/main" noChangeAspect="1"/>
+            </wp:cNvGraphicFramePr>
+            <a:graphic xmlns:a="http://schemas.openxmlformats.org/drawingml/2006/main">
+              <a:graphicData uri="http://schemas.openxmlformats.org/drawingml/2006/picture">
+                <pic:pic xmlns:pic="http://schemas.openxmlformats.org/drawingml/2006/picture">
+                  <pic:nvPicPr>
+                    <pic:cNvPr id="709296657" name=""/>
+                    <pic:cNvPicPr/>
+                  </pic:nvPicPr>
+                  <pic:blipFill>
+                    <a:blip r:embed="rId20" cstate="print">
+                      <a:extLst>
+                        <a:ext uri="{28A0092B-C50C-407E-A947-70E740481C1C}">
+                          <a14:useLocalDpi xmlns:a14="http://schemas.microsoft.com/office/drawing/2010/main" val="0"/>
+                        </a:ext>
+                      </a:extLst>
+                    </a:blip>
+                    <a:stretch>
+                      <a:fillRect/>
+                    </a:stretch>
+                  </pic:blipFill>
+                  <pic:spPr>
+                    <a:xfrm>
+                      <a:off x="0" y="0"/>
+                      <a:ext cx="5943600" cy="5272405"/>
+                    </a:xfrm>
+                    <a:prstGeom prst="rect">
+                      <a:avLst/>
+                    </a:prstGeom>
+                  </pic:spPr>
+                </pic:pic>
+              </a:graphicData>
+            </a:graphic>
+          </wp:inline>
+        </w:drawing>
+      </w:r>
+    </w:p>
+    <w:p>
+      <w:pPr>
+        <w:pStyle w:val="Caption"/>
+        <w:rPr>
+          <w:sz w:val="20"/>
+        </w:rPr>
+      </w:pPr>
+      <w:r>
+        <w:rPr>
+          <w:sz w:val="20"/>
+        </w:rPr>
+        <w:t>Figure 3.6 - ER Attributes: Tenancy and Finance</w:t>
+      </w:r>
+    </w:p>
+    <w:p>
+      <w:pPr>
+        <w:spacing w:after="160" w:line="259" w:lineRule="auto"/>
+        <w:jc w:val="left"/>
+      </w:pPr>
+      <w:r>
+        <w:br w:type="page"/>
+      </w:r>
+    </w:p>
+    <w:p>
+      <w:pPr>
+        <w:jc w:val="center"/>
+      </w:pPr>
+      <w:r>
+        <w:rPr>
+          <w:noProof/>
+        </w:rPr>
+        <w:lastRenderedPageBreak/>
+        <w:drawing>
+          <wp:inline distT="0" distB="0" distL="0" distR="0" wp14:anchorId="175A4FDA" wp14:editId="1297FDC1">
+            <wp:extent cx="5943600" cy="5401310"/>
+            <wp:effectExtent l="0" t="0" r="0" b="8890"/>
+            <wp:docPr id="1853921432" name="Picture 7"/>
+            <wp:cNvGraphicFramePr>
+              <a:graphicFrameLocks xmlns:a="http://schemas.openxmlformats.org/drawingml/2006/main" noChangeAspect="1"/>
+            </wp:cNvGraphicFramePr>
+            <a:graphic xmlns:a="http://schemas.openxmlformats.org/drawingml/2006/main">
+              <a:graphicData uri="http://schemas.openxmlformats.org/drawingml/2006/picture">
+                <pic:pic xmlns:pic="http://schemas.openxmlformats.org/drawingml/2006/picture">
+                  <pic:nvPicPr>
+                    <pic:cNvPr id="1853921432" name=""/>
+                    <pic:cNvPicPr/>
+                  </pic:nvPicPr>
+                  <pic:blipFill>
+                    <a:blip r:embed="rId21" cstate="print">
+                      <a:extLst>
+                        <a:ext uri="{28A0092B-C50C-407E-A947-70E740481C1C}">
+                          <a14:useLocalDpi xmlns:a14="http://schemas.microsoft.com/office/drawing/2010/main" val="0"/>
+                        </a:ext>
+                      </a:extLst>
+                    </a:blip>
+                    <a:stretch>
+                      <a:fillRect/>
+                    </a:stretch>
+                  </pic:blipFill>
+                  <pic:spPr>
+                    <a:xfrm>
+                      <a:off x="0" y="0"/>
+                      <a:ext cx="5943600" cy="5401310"/>
+                    </a:xfrm>
+                    <a:prstGeom prst="rect">
+                      <a:avLst/>
+                    </a:prstGeom>
+                  </pic:spPr>
+                </pic:pic>
+              </a:graphicData>
+            </a:graphic>
+          </wp:inline>
+        </w:drawing>
+      </w:r>
+    </w:p>
+    <w:p>
+      <w:pPr>
+        <w:pStyle w:val="Caption"/>
+        <w:rPr>
+          <w:sz w:val="20"/>
+        </w:rPr>
+      </w:pPr>
+      <w:r>
+        <w:rPr>
+          <w:sz w:val="20"/>
+        </w:rPr>
+        <w:t>Figure 3.7 - ER Attributes: Complaints and Legal Operations</w:t>
+      </w:r>
+    </w:p>
+    <w:p>
+      <w:pPr>
+        <w:spacing w:after="160" w:line="259" w:lineRule="auto"/>
+        <w:jc w:val="left"/>
+      </w:pPr>
+      <w:r>
+        <w:br w:type="page"/>
+      </w:r>
+    </w:p>
+    <w:p>
+      <w:pPr>
+        <w:jc w:val="center"/>
+      </w:pPr>
+      <w:r>
+        <w:rPr>
+          <w:noProof/>
+        </w:rPr>
+        <w:lastRenderedPageBreak/>
+        <w:drawing>
+          <wp:inline distT="0" distB="0" distL="0" distR="0" wp14:anchorId="166F622D" wp14:editId="7722F182">
+            <wp:extent cx="5943600" cy="2669540"/>
+            <wp:effectExtent l="0" t="0" r="0" b="0"/>
+            <wp:docPr id="1844395899" name="Picture 8"/>
+            <wp:cNvGraphicFramePr>
+              <a:graphicFrameLocks xmlns:a="http://schemas.openxmlformats.org/drawingml/2006/main" noChangeAspect="1"/>
+            </wp:cNvGraphicFramePr>
+            <a:graphic xmlns:a="http://schemas.openxmlformats.org/drawingml/2006/main">
+              <a:graphicData uri="http://schemas.openxmlformats.org/drawingml/2006/picture">
+                <pic:pic xmlns:pic="http://schemas.openxmlformats.org/drawingml/2006/picture">
+                  <pic:nvPicPr>
+                    <pic:cNvPr id="1844395899" name=""/>
+                    <pic:cNvPicPr/>
+                  </pic:nvPicPr>
+                  <pic:blipFill>
+                    <a:blip r:embed="rId22" cstate="print">
+                      <a:extLst>
+                        <a:ext uri="{28A0092B-C50C-407E-A947-70E740481C1C}">
+                          <a14:useLocalDpi xmlns:a14="http://schemas.microsoft.com/office/drawing/2010/main" val="0"/>
+                        </a:ext>
+                      </a:extLst>
+                    </a:blip>
+                    <a:stretch>
+                      <a:fillRect/>
+                    </a:stretch>
+                  </pic:blipFill>
+                  <pic:spPr>
+                    <a:xfrm>
+                      <a:off x="0" y="0"/>
+                      <a:ext cx="5943600" cy="2669540"/>
+                    </a:xfrm>
+                    <a:prstGeom prst="rect">
+                      <a:avLst/>
+                    </a:prstGeom>
+                  </pic:spPr>
+                </pic:pic>
+              </a:graphicData>
+            </a:graphic>
+          </wp:inline>
+        </w:drawing>
+      </w:r>
+    </w:p>
+    <w:p>
+      <w:pPr>
+        <w:pStyle w:val="Caption"/>
+        <w:rPr>
+          <w:sz w:val="20"/>
+        </w:rPr>
+      </w:pPr>
+      <w:r>
+        <w:rPr>
+          <w:sz w:val="20"/>
+        </w:rPr>
+        <w:t>Figure 3.8 - ER Attributes: Approvals and Notifications</w:t>
+      </w:r>
+    </w:p>
+    <w:p>
+      <w:pPr>
         <w:pStyle w:val="Heading2"/>
       </w:pPr>
-      <w:bookmarkStart w:id="15" w:name="_Toc238500509"/>
+      <w:bookmarkStart w:id="15" w:name="_Toc238503164"/>
       <w:r>
         <w:t>3.3 Requirement Specification</w:t>
       </w:r>
@@ -6230,7 +6530,7 @@
       <w:pPr>
         <w:pStyle w:val="Heading3"/>
       </w:pPr>
-      <w:bookmarkStart w:id="16" w:name="_Toc238500510"/>
+      <w:bookmarkStart w:id="16" w:name="_Toc238503165"/>
       <w:r>
         <w:t>Functional Requirements</w:t>
       </w:r>
@@ -7063,7 +7363,6 @@
               <w:rPr>
                 <w:sz w:val="18"/>
               </w:rPr>
-              <w:lastRenderedPageBreak/>
               <w:t>FR-10</w:t>
             </w:r>
           </w:p>
@@ -7449,6 +7748,7 @@
               <w:rPr>
                 <w:sz w:val="18"/>
               </w:rPr>
+              <w:lastRenderedPageBreak/>
               <w:t>FR-15</w:t>
             </w:r>
           </w:p>
@@ -7882,7 +8182,7 @@
       <w:pPr>
         <w:pStyle w:val="Heading3"/>
       </w:pPr>
-      <w:bookmarkStart w:id="17" w:name="_Toc238500511"/>
+      <w:bookmarkStart w:id="17" w:name="_Toc238503166"/>
       <w:r>
         <w:t>Non-Functional Requirements</w:t>
       </w:r>
@@ -8454,7 +8754,7 @@
       <w:pPr>
         <w:pStyle w:val="Heading3"/>
       </w:pPr>
-      <w:bookmarkStart w:id="18" w:name="_Toc238500512"/>
+      <w:bookmarkStart w:id="18" w:name="_Toc238503167"/>
       <w:r>
         <w:t>Role Permission Matrix</w:t>
       </w:r>
@@ -8622,7 +8922,6 @@
               <w:rPr>
                 <w:sz w:val="18"/>
               </w:rPr>
-              <w:lastRenderedPageBreak/>
               <w:t>Self-registration</w:t>
             </w:r>
           </w:p>
@@ -9123,6 +9422,7 @@
               <w:rPr>
                 <w:sz w:val="18"/>
               </w:rPr>
+              <w:lastRenderedPageBreak/>
               <w:t>Manage invoices</w:t>
             </w:r>
           </w:p>
@@ -10196,7 +10496,7 @@
       <w:pPr>
         <w:pStyle w:val="Heading2"/>
       </w:pPr>
-      <w:bookmarkStart w:id="19" w:name="_Toc238500513"/>
+      <w:bookmarkStart w:id="19" w:name="_Toc238503168"/>
       <w:r>
         <w:t>3.4 Hardware and Software Requirements</w:t>
       </w:r>
@@ -10206,7 +10506,7 @@
       <w:pPr>
         <w:pStyle w:val="Heading3"/>
       </w:pPr>
-      <w:bookmarkStart w:id="20" w:name="_Toc238500514"/>
+      <w:bookmarkStart w:id="20" w:name="_Toc238503169"/>
       <w:r>
         <w:t>Development Hardware</w:t>
       </w:r>
@@ -10248,43 +10548,43 @@
       <w:pPr>
         <w:pStyle w:val="Heading3"/>
       </w:pPr>
-      <w:bookmarkStart w:id="21" w:name="_Toc238500515"/>
+      <w:bookmarkStart w:id="21" w:name="_Toc238503170"/>
+      <w:r>
+        <w:t>Client Hardware</w:t>
+      </w:r>
+      <w:bookmarkEnd w:id="21"/>
+    </w:p>
+    <w:p>
+      <w:pPr>
+        <w:pStyle w:val="ListBullet"/>
+      </w:pPr>
+      <w:r>
+        <w:t>Desktop, laptop, tablet or modern smartphone.</w:t>
+      </w:r>
+    </w:p>
+    <w:p>
+      <w:pPr>
+        <w:pStyle w:val="ListBullet"/>
+      </w:pPr>
+      <w:r>
+        <w:t>Display resolution of at least 360 pixels width.</w:t>
+      </w:r>
+    </w:p>
+    <w:p>
+      <w:pPr>
+        <w:pStyle w:val="ListBullet"/>
+      </w:pPr>
+      <w:r>
+        <w:t>Internet connection and a current standards-compliant browser.</w:t>
+      </w:r>
+    </w:p>
+    <w:p>
+      <w:pPr>
+        <w:pStyle w:val="Heading3"/>
+      </w:pPr>
+      <w:bookmarkStart w:id="22" w:name="_Toc238503171"/>
       <w:r>
         <w:lastRenderedPageBreak/>
-        <w:t>Client Hardware</w:t>
-      </w:r>
-      <w:bookmarkEnd w:id="21"/>
-    </w:p>
-    <w:p>
-      <w:pPr>
-        <w:pStyle w:val="ListBullet"/>
-      </w:pPr>
-      <w:r>
-        <w:t>Desktop, laptop, tablet or modern smartphone.</w:t>
-      </w:r>
-    </w:p>
-    <w:p>
-      <w:pPr>
-        <w:pStyle w:val="ListBullet"/>
-      </w:pPr>
-      <w:r>
-        <w:t>Display resolution of at least 360 pixels width.</w:t>
-      </w:r>
-    </w:p>
-    <w:p>
-      <w:pPr>
-        <w:pStyle w:val="ListBullet"/>
-      </w:pPr>
-      <w:r>
-        <w:t>Internet connection and a current standards-compliant browser.</w:t>
-      </w:r>
-    </w:p>
-    <w:p>
-      <w:pPr>
-        <w:pStyle w:val="Heading3"/>
-      </w:pPr>
-      <w:bookmarkStart w:id="22" w:name="_Toc238500516"/>
-      <w:r>
         <w:t>Software</w:t>
       </w:r>
       <w:bookmarkEnd w:id="22"/>
@@ -10864,7 +11164,7 @@
       <w:pPr>
         <w:pStyle w:val="Heading1"/>
       </w:pPr>
-      <w:bookmarkStart w:id="23" w:name="_Toc238500517"/>
+      <w:bookmarkStart w:id="23" w:name="_Toc238503172"/>
       <w:r>
         <w:lastRenderedPageBreak/>
         <w:t>4. SYSTEM DESIGN</w:t>
@@ -10875,7 +11175,7 @@
       <w:pPr>
         <w:pStyle w:val="Heading2"/>
       </w:pPr>
-      <w:bookmarkStart w:id="24" w:name="_Toc238500518"/>
+      <w:bookmarkStart w:id="24" w:name="_Toc238503173"/>
       <w:r>
         <w:t>4.1 Architectural Design</w:t>
       </w:r>
@@ -10895,10 +11195,10 @@
           <w:noProof/>
         </w:rPr>
         <w:drawing>
-          <wp:inline distT="0" distB="0" distL="0" distR="0" wp14:anchorId="65454598" wp14:editId="4F68D3DF">
+          <wp:inline distT="0" distB="0" distL="0" distR="0" wp14:anchorId="403C9E3B" wp14:editId="161D250C">
             <wp:extent cx="5943600" cy="3714750"/>
             <wp:effectExtent l="0" t="0" r="0" b="0"/>
-            <wp:docPr id="1135756127" name="Picture 5"/>
+            <wp:docPr id="8424682" name="Picture 9"/>
             <wp:cNvGraphicFramePr>
               <a:graphicFrameLocks xmlns:a="http://schemas.openxmlformats.org/drawingml/2006/main" noChangeAspect="1"/>
             </wp:cNvGraphicFramePr>
@@ -10906,403 +11206,7 @@
               <a:graphicData uri="http://schemas.openxmlformats.org/drawingml/2006/picture">
                 <pic:pic xmlns:pic="http://schemas.openxmlformats.org/drawingml/2006/picture">
                   <pic:nvPicPr>
-                    <pic:cNvPr id="1135756127" name=""/>
-                    <pic:cNvPicPr/>
-                  </pic:nvPicPr>
-                  <pic:blipFill>
-                    <a:blip r:embed="rId19" cstate="print">
-                      <a:extLst>
-                        <a:ext uri="{28A0092B-C50C-407E-A947-70E740481C1C}">
-                          <a14:useLocalDpi xmlns:a14="http://schemas.microsoft.com/office/drawing/2010/main" val="0"/>
-                        </a:ext>
-                      </a:extLst>
-                    </a:blip>
-                    <a:stretch>
-                      <a:fillRect/>
-                    </a:stretch>
-                  </pic:blipFill>
-                  <pic:spPr>
-                    <a:xfrm>
-                      <a:off x="0" y="0"/>
-                      <a:ext cx="5943600" cy="3714750"/>
-                    </a:xfrm>
-                    <a:prstGeom prst="rect">
-                      <a:avLst/>
-                    </a:prstGeom>
-                  </pic:spPr>
-                </pic:pic>
-              </a:graphicData>
-            </a:graphic>
-          </wp:inline>
-        </w:drawing>
-      </w:r>
-    </w:p>
-    <w:p>
-      <w:pPr>
-        <w:pStyle w:val="Caption"/>
-        <w:rPr>
-          <w:sz w:val="20"/>
-        </w:rPr>
-      </w:pPr>
-      <w:r>
-        <w:rPr>
-          <w:sz w:val="20"/>
-        </w:rPr>
-        <w:t>Figure 4.1 - Layered System Architecture</w:t>
-      </w:r>
-    </w:p>
-    <w:p>
-      <w:pPr>
-        <w:pStyle w:val="Heading3"/>
-      </w:pPr>
-      <w:bookmarkStart w:id="25" w:name="_Toc238500519"/>
-      <w:r>
-        <w:t>Component Responsibilities</w:t>
-      </w:r>
-      <w:bookmarkEnd w:id="25"/>
-    </w:p>
-    <w:p>
-      <w:pPr>
-        <w:pStyle w:val="ListBullet"/>
-      </w:pPr>
-      <w:r>
-        <w:t>Pages/components: presentation, user input, loading/error states and navigation.</w:t>
-      </w:r>
-    </w:p>
-    <w:p>
-      <w:pPr>
-        <w:pStyle w:val="ListBullet"/>
-      </w:pPr>
-      <w:r>
-        <w:t>Module configuration: fields, columns and labels for reusable CRUD views.</w:t>
-      </w:r>
-    </w:p>
-    <w:p>
-      <w:pPr>
-        <w:pStyle w:val="ListBullet"/>
-      </w:pPr>
-      <w:r>
-        <w:t>Authentication context: session lifecycle, decoded role and logout.</w:t>
-      </w:r>
-    </w:p>
-    <w:p>
-      <w:pPr>
-        <w:pStyle w:val="ListBullet"/>
-      </w:pPr>
-      <w:r>
-        <w:t>Controllers: request validation, route mapping and role constraints.</w:t>
-      </w:r>
-    </w:p>
-    <w:p>
-      <w:pPr>
-        <w:pStyle w:val="ListBullet"/>
-      </w:pPr>
-      <w:r>
-        <w:t>DTO mapper: separates external API structures from persistence entities.</w:t>
-      </w:r>
-    </w:p>
-    <w:p>
-      <w:pPr>
-        <w:pStyle w:val="ListBullet"/>
-      </w:pPr>
-      <w:r>
-        <w:lastRenderedPageBreak/>
-        <w:t>Services: ownership checks, payment lifecycle, approval state transitions and notifications.</w:t>
-      </w:r>
-    </w:p>
-    <w:p>
-      <w:pPr>
-        <w:pStyle w:val="ListBullet"/>
-      </w:pPr>
-      <w:r>
-        <w:t>Repositories: persistence queries including organization and tenant filters.</w:t>
-      </w:r>
-    </w:p>
-    <w:p>
-      <w:pPr>
-        <w:pStyle w:val="ListBullet"/>
-      </w:pPr>
-      <w:r>
-        <w:t>Audit listener: creation, update and deletion metadata.</w:t>
-      </w:r>
-    </w:p>
-    <w:p>
-      <w:pPr>
-        <w:pStyle w:val="ListBullet"/>
-      </w:pPr>
-      <w:r>
-        <w:t>Database: durable relational state.</w:t>
-      </w:r>
-    </w:p>
-    <w:p>
-      <w:pPr>
-        <w:pStyle w:val="Heading2"/>
-      </w:pPr>
-      <w:bookmarkStart w:id="26" w:name="_Toc238500520"/>
-      <w:r>
-        <w:t>4.2 UML Diagrams</w:t>
-      </w:r>
-      <w:bookmarkEnd w:id="26"/>
-    </w:p>
-    <w:p>
-      <w:pPr>
-        <w:pStyle w:val="Heading3"/>
-      </w:pPr>
-      <w:bookmarkStart w:id="27" w:name="_Toc238500521"/>
-      <w:r>
-        <w:t>4.2.1 Class Diagram</w:t>
-      </w:r>
-      <w:bookmarkEnd w:id="27"/>
-    </w:p>
-    <w:p>
-      <w:pPr>
-        <w:jc w:val="center"/>
-      </w:pPr>
-      <w:r>
-        <w:rPr>
-          <w:noProof/>
-        </w:rPr>
-        <w:drawing>
-          <wp:inline distT="0" distB="0" distL="0" distR="0" wp14:anchorId="181A7F9A" wp14:editId="3FCA4FEB">
-            <wp:extent cx="5943600" cy="3714750"/>
-            <wp:effectExtent l="0" t="0" r="0" b="0"/>
-            <wp:docPr id="1579405487" name="Picture 6"/>
-            <wp:cNvGraphicFramePr>
-              <a:graphicFrameLocks xmlns:a="http://schemas.openxmlformats.org/drawingml/2006/main" noChangeAspect="1"/>
-            </wp:cNvGraphicFramePr>
-            <a:graphic xmlns:a="http://schemas.openxmlformats.org/drawingml/2006/main">
-              <a:graphicData uri="http://schemas.openxmlformats.org/drawingml/2006/picture">
-                <pic:pic xmlns:pic="http://schemas.openxmlformats.org/drawingml/2006/picture">
-                  <pic:nvPicPr>
-                    <pic:cNvPr id="1579405487" name=""/>
-                    <pic:cNvPicPr/>
-                  </pic:nvPicPr>
-                  <pic:blipFill>
-                    <a:blip r:embed="rId20" cstate="print">
-                      <a:extLst>
-                        <a:ext uri="{28A0092B-C50C-407E-A947-70E740481C1C}">
-                          <a14:useLocalDpi xmlns:a14="http://schemas.microsoft.com/office/drawing/2010/main" val="0"/>
-                        </a:ext>
-                      </a:extLst>
-                    </a:blip>
-                    <a:stretch>
-                      <a:fillRect/>
-                    </a:stretch>
-                  </pic:blipFill>
-                  <pic:spPr>
-                    <a:xfrm>
-                      <a:off x="0" y="0"/>
-                      <a:ext cx="5943600" cy="3714750"/>
-                    </a:xfrm>
-                    <a:prstGeom prst="rect">
-                      <a:avLst/>
-                    </a:prstGeom>
-                  </pic:spPr>
-                </pic:pic>
-              </a:graphicData>
-            </a:graphic>
-          </wp:inline>
-        </w:drawing>
-      </w:r>
-    </w:p>
-    <w:p>
-      <w:pPr>
-        <w:pStyle w:val="Caption"/>
-        <w:rPr>
-          <w:sz w:val="20"/>
-        </w:rPr>
-      </w:pPr>
-      <w:r>
-        <w:rPr>
-          <w:sz w:val="20"/>
-        </w:rPr>
-        <w:t>Figure 4.2 - Domain Class Diagram</w:t>
-      </w:r>
-    </w:p>
-    <w:p>
-      <w:pPr>
-        <w:pStyle w:val="Heading3"/>
-      </w:pPr>
-      <w:bookmarkStart w:id="28" w:name="_Toc238500522"/>
-      <w:r>
-        <w:lastRenderedPageBreak/>
-        <w:t>Backend Layer Class Diagram</w:t>
-      </w:r>
-      <w:bookmarkEnd w:id="28"/>
-    </w:p>
-    <w:p>
-      <w:pPr>
-        <w:jc w:val="center"/>
-      </w:pPr>
-      <w:r>
-        <w:rPr>
-          <w:noProof/>
-        </w:rPr>
-        <w:drawing>
-          <wp:inline distT="0" distB="0" distL="0" distR="0" wp14:anchorId="0896646A" wp14:editId="29EE8E00">
-            <wp:extent cx="5943600" cy="3714750"/>
-            <wp:effectExtent l="0" t="0" r="0" b="0"/>
-            <wp:docPr id="1399820396" name="Picture 7"/>
-            <wp:cNvGraphicFramePr>
-              <a:graphicFrameLocks xmlns:a="http://schemas.openxmlformats.org/drawingml/2006/main" noChangeAspect="1"/>
-            </wp:cNvGraphicFramePr>
-            <a:graphic xmlns:a="http://schemas.openxmlformats.org/drawingml/2006/main">
-              <a:graphicData uri="http://schemas.openxmlformats.org/drawingml/2006/picture">
-                <pic:pic xmlns:pic="http://schemas.openxmlformats.org/drawingml/2006/picture">
-                  <pic:nvPicPr>
-                    <pic:cNvPr id="1399820396" name=""/>
-                    <pic:cNvPicPr/>
-                  </pic:nvPicPr>
-                  <pic:blipFill>
-                    <a:blip r:embed="rId21" cstate="print">
-                      <a:extLst>
-                        <a:ext uri="{28A0092B-C50C-407E-A947-70E740481C1C}">
-                          <a14:useLocalDpi xmlns:a14="http://schemas.microsoft.com/office/drawing/2010/main" val="0"/>
-                        </a:ext>
-                      </a:extLst>
-                    </a:blip>
-                    <a:stretch>
-                      <a:fillRect/>
-                    </a:stretch>
-                  </pic:blipFill>
-                  <pic:spPr>
-                    <a:xfrm>
-                      <a:off x="0" y="0"/>
-                      <a:ext cx="5943600" cy="3714750"/>
-                    </a:xfrm>
-                    <a:prstGeom prst="rect">
-                      <a:avLst/>
-                    </a:prstGeom>
-                  </pic:spPr>
-                </pic:pic>
-              </a:graphicData>
-            </a:graphic>
-          </wp:inline>
-        </w:drawing>
-      </w:r>
-    </w:p>
-    <w:p>
-      <w:pPr>
-        <w:pStyle w:val="Caption"/>
-        <w:rPr>
-          <w:sz w:val="20"/>
-        </w:rPr>
-      </w:pPr>
-      <w:r>
-        <w:rPr>
-          <w:sz w:val="20"/>
-        </w:rPr>
-        <w:t>Figure 4.3 - Backend Layer Class Diagram</w:t>
-      </w:r>
-    </w:p>
-    <w:p>
-      <w:pPr>
-        <w:pStyle w:val="Heading3"/>
-      </w:pPr>
-      <w:bookmarkStart w:id="29" w:name="_Toc238500523"/>
-      <w:r>
-        <w:t>4.2.2 Sequence Diagrams</w:t>
-      </w:r>
-      <w:bookmarkEnd w:id="29"/>
-    </w:p>
-    <w:p>
-      <w:r>
-        <w:t>#### Login Sequence</w:t>
-      </w:r>
-    </w:p>
-    <w:p>
-      <w:pPr>
-        <w:jc w:val="center"/>
-      </w:pPr>
-      <w:r>
-        <w:rPr>
-          <w:noProof/>
-        </w:rPr>
-        <w:lastRenderedPageBreak/>
-        <w:drawing>
-          <wp:inline distT="0" distB="0" distL="0" distR="0" wp14:anchorId="11AC6E14" wp14:editId="2EA27851">
-            <wp:extent cx="5943600" cy="3714750"/>
-            <wp:effectExtent l="0" t="0" r="0" b="0"/>
-            <wp:docPr id="876720306" name="Picture 8"/>
-            <wp:cNvGraphicFramePr>
-              <a:graphicFrameLocks xmlns:a="http://schemas.openxmlformats.org/drawingml/2006/main" noChangeAspect="1"/>
-            </wp:cNvGraphicFramePr>
-            <a:graphic xmlns:a="http://schemas.openxmlformats.org/drawingml/2006/main">
-              <a:graphicData uri="http://schemas.openxmlformats.org/drawingml/2006/picture">
-                <pic:pic xmlns:pic="http://schemas.openxmlformats.org/drawingml/2006/picture">
-                  <pic:nvPicPr>
-                    <pic:cNvPr id="876720306" name=""/>
-                    <pic:cNvPicPr/>
-                  </pic:nvPicPr>
-                  <pic:blipFill>
-                    <a:blip r:embed="rId22" cstate="print">
-                      <a:extLst>
-                        <a:ext uri="{28A0092B-C50C-407E-A947-70E740481C1C}">
-                          <a14:useLocalDpi xmlns:a14="http://schemas.microsoft.com/office/drawing/2010/main" val="0"/>
-                        </a:ext>
-                      </a:extLst>
-                    </a:blip>
-                    <a:stretch>
-                      <a:fillRect/>
-                    </a:stretch>
-                  </pic:blipFill>
-                  <pic:spPr>
-                    <a:xfrm>
-                      <a:off x="0" y="0"/>
-                      <a:ext cx="5943600" cy="3714750"/>
-                    </a:xfrm>
-                    <a:prstGeom prst="rect">
-                      <a:avLst/>
-                    </a:prstGeom>
-                  </pic:spPr>
-                </pic:pic>
-              </a:graphicData>
-            </a:graphic>
-          </wp:inline>
-        </w:drawing>
-      </w:r>
-    </w:p>
-    <w:p>
-      <w:pPr>
-        <w:pStyle w:val="Caption"/>
-        <w:rPr>
-          <w:sz w:val="20"/>
-        </w:rPr>
-      </w:pPr>
-      <w:r>
-        <w:rPr>
-          <w:sz w:val="20"/>
-        </w:rPr>
-        <w:t>Figure 4.4 - Booking-to-Tenancy Sequence</w:t>
-      </w:r>
-    </w:p>
-    <w:p>
-      <w:r>
-        <w:t>#### Apartment Booking and Approval Sequence</w:t>
-      </w:r>
-    </w:p>
-    <w:p>
-      <w:pPr>
-        <w:jc w:val="center"/>
-      </w:pPr>
-      <w:r>
-        <w:rPr>
-          <w:noProof/>
-        </w:rPr>
-        <w:lastRenderedPageBreak/>
-        <w:drawing>
-          <wp:inline distT="0" distB="0" distL="0" distR="0" wp14:anchorId="3DC6BBE4" wp14:editId="653147F5">
-            <wp:extent cx="5943600" cy="3714750"/>
-            <wp:effectExtent l="0" t="0" r="0" b="0"/>
-            <wp:docPr id="1089417115" name="Picture 9"/>
-            <wp:cNvGraphicFramePr>
-              <a:graphicFrameLocks xmlns:a="http://schemas.openxmlformats.org/drawingml/2006/main" noChangeAspect="1"/>
-            </wp:cNvGraphicFramePr>
-            <a:graphic xmlns:a="http://schemas.openxmlformats.org/drawingml/2006/main">
-              <a:graphicData uri="http://schemas.openxmlformats.org/drawingml/2006/picture">
-                <pic:pic xmlns:pic="http://schemas.openxmlformats.org/drawingml/2006/picture">
-                  <pic:nvPicPr>
-                    <pic:cNvPr id="1089417115" name=""/>
+                    <pic:cNvPr id="8424682" name=""/>
                     <pic:cNvPicPr/>
                   </pic:nvPicPr>
                   <pic:blipFill>
@@ -11344,13 +11248,111 @@
         <w:rPr>
           <w:sz w:val="20"/>
         </w:rPr>
-        <w:t>Figure 4.5 - Payment Sequence</w:t>
-      </w:r>
-    </w:p>
-    <w:p>
-      <w:r>
-        <w:t>#### Verified Payment Sequence</w:t>
-      </w:r>
+        <w:t>Figure 4.1 - Layered System Architecture</w:t>
+      </w:r>
+    </w:p>
+    <w:p>
+      <w:pPr>
+        <w:pStyle w:val="Heading3"/>
+      </w:pPr>
+      <w:bookmarkStart w:id="25" w:name="_Toc238503174"/>
+      <w:r>
+        <w:t>Component Responsibilities</w:t>
+      </w:r>
+      <w:bookmarkEnd w:id="25"/>
+    </w:p>
+    <w:p>
+      <w:pPr>
+        <w:pStyle w:val="ListBullet"/>
+      </w:pPr>
+      <w:r>
+        <w:t>Pages/components: presentation, user input, loading/error states and navigation.</w:t>
+      </w:r>
+    </w:p>
+    <w:p>
+      <w:pPr>
+        <w:pStyle w:val="ListBullet"/>
+      </w:pPr>
+      <w:r>
+        <w:t>Module configuration: fields, columns and labels for reusable CRUD views.</w:t>
+      </w:r>
+    </w:p>
+    <w:p>
+      <w:pPr>
+        <w:pStyle w:val="ListBullet"/>
+      </w:pPr>
+      <w:r>
+        <w:t>Authentication context: session lifecycle, decoded role and logout.</w:t>
+      </w:r>
+    </w:p>
+    <w:p>
+      <w:pPr>
+        <w:pStyle w:val="ListBullet"/>
+      </w:pPr>
+      <w:r>
+        <w:t>Controllers: request validation, route mapping and role constraints.</w:t>
+      </w:r>
+    </w:p>
+    <w:p>
+      <w:pPr>
+        <w:pStyle w:val="ListBullet"/>
+      </w:pPr>
+      <w:r>
+        <w:t>DTO mapper: separates external API structures from persistence entities.</w:t>
+      </w:r>
+    </w:p>
+    <w:p>
+      <w:pPr>
+        <w:pStyle w:val="ListBullet"/>
+      </w:pPr>
+      <w:r>
+        <w:lastRenderedPageBreak/>
+        <w:t>Services: ownership checks, payment lifecycle, approval state transitions and notifications.</w:t>
+      </w:r>
+    </w:p>
+    <w:p>
+      <w:pPr>
+        <w:pStyle w:val="ListBullet"/>
+      </w:pPr>
+      <w:r>
+        <w:t>Repositories: persistence queries including organization and tenant filters.</w:t>
+      </w:r>
+    </w:p>
+    <w:p>
+      <w:pPr>
+        <w:pStyle w:val="ListBullet"/>
+      </w:pPr>
+      <w:r>
+        <w:t>Audit listener: creation, update and deletion metadata.</w:t>
+      </w:r>
+    </w:p>
+    <w:p>
+      <w:pPr>
+        <w:pStyle w:val="ListBullet"/>
+      </w:pPr>
+      <w:r>
+        <w:t>Database: durable relational state.</w:t>
+      </w:r>
+    </w:p>
+    <w:p>
+      <w:pPr>
+        <w:pStyle w:val="Heading2"/>
+      </w:pPr>
+      <w:bookmarkStart w:id="26" w:name="_Toc238503175"/>
+      <w:r>
+        <w:t>4.2 UML Diagrams</w:t>
+      </w:r>
+      <w:bookmarkEnd w:id="26"/>
+    </w:p>
+    <w:p>
+      <w:pPr>
+        <w:pStyle w:val="Heading3"/>
+      </w:pPr>
+      <w:bookmarkStart w:id="27" w:name="_Toc238503176"/>
+      <w:r>
+        <w:t>4.2.1 Class Diagram</w:t>
+      </w:r>
+      <w:bookmarkEnd w:id="27"/>
     </w:p>
     <w:p>
       <w:pPr>
@@ -11360,12 +11362,11 @@
         <w:rPr>
           <w:noProof/>
         </w:rPr>
-        <w:lastRenderedPageBreak/>
         <w:drawing>
-          <wp:inline distT="0" distB="0" distL="0" distR="0" wp14:anchorId="07222738" wp14:editId="15688133">
+          <wp:inline distT="0" distB="0" distL="0" distR="0" wp14:anchorId="5B34EEC0" wp14:editId="018CEAED">
             <wp:extent cx="5943600" cy="3714750"/>
             <wp:effectExtent l="0" t="0" r="0" b="0"/>
-            <wp:docPr id="1606545014" name="Picture 10"/>
+            <wp:docPr id="438773111" name="Picture 10"/>
             <wp:cNvGraphicFramePr>
               <a:graphicFrameLocks xmlns:a="http://schemas.openxmlformats.org/drawingml/2006/main" noChangeAspect="1"/>
             </wp:cNvGraphicFramePr>
@@ -11373,7 +11374,7 @@
               <a:graphicData uri="http://schemas.openxmlformats.org/drawingml/2006/picture">
                 <pic:pic xmlns:pic="http://schemas.openxmlformats.org/drawingml/2006/picture">
                   <pic:nvPicPr>
-                    <pic:cNvPr id="1606545014" name=""/>
+                    <pic:cNvPr id="438773111" name=""/>
                     <pic:cNvPicPr/>
                   </pic:nvPicPr>
                   <pic:blipFill>
@@ -11415,12 +11416,16 @@
         <w:rPr>
           <w:sz w:val="20"/>
         </w:rPr>
-        <w:t>Figure 4.6 - Complaint and Maintenance Sequence</w:t>
-      </w:r>
-    </w:p>
-    <w:p>
-      <w:r>
-        <w:t>#### Real-Time Notification Sequence</w:t>
+        <w:t>Figure 4.2 - Domain Class Diagram</w:t>
+      </w:r>
+    </w:p>
+    <w:p>
+      <w:pPr>
+        <w:spacing w:after="160" w:line="259" w:lineRule="auto"/>
+        <w:jc w:val="left"/>
+      </w:pPr>
+      <w:r>
+        <w:br w:type="page"/>
       </w:r>
     </w:p>
     <w:p>
@@ -11433,10 +11438,10 @@
         </w:rPr>
         <w:lastRenderedPageBreak/>
         <w:drawing>
-          <wp:inline distT="0" distB="0" distL="0" distR="0" wp14:anchorId="54B5A273" wp14:editId="0A7A6B06">
+          <wp:inline distT="0" distB="0" distL="0" distR="0" wp14:anchorId="39046D75" wp14:editId="4FBC3011">
             <wp:extent cx="5943600" cy="3714750"/>
             <wp:effectExtent l="0" t="0" r="0" b="0"/>
-            <wp:docPr id="1374191855" name="Picture 11"/>
+            <wp:docPr id="1296260251" name="Picture 11"/>
             <wp:cNvGraphicFramePr>
               <a:graphicFrameLocks xmlns:a="http://schemas.openxmlformats.org/drawingml/2006/main" noChangeAspect="1"/>
             </wp:cNvGraphicFramePr>
@@ -11444,7 +11449,7 @@
               <a:graphicData uri="http://schemas.openxmlformats.org/drawingml/2006/picture">
                 <pic:pic xmlns:pic="http://schemas.openxmlformats.org/drawingml/2006/picture">
                   <pic:nvPicPr>
-                    <pic:cNvPr id="1374191855" name=""/>
+                    <pic:cNvPr id="1296260251" name=""/>
                     <pic:cNvPicPr/>
                   </pic:nvPicPr>
                   <pic:blipFill>
@@ -11486,19 +11491,19 @@
         <w:rPr>
           <w:sz w:val="20"/>
         </w:rPr>
-        <w:t>Figure 4.7 - Deposit Dispute Settlement Sequence</w:t>
+        <w:t>Figure 4.3 - Operational Class Diagram</w:t>
       </w:r>
     </w:p>
     <w:p>
       <w:pPr>
         <w:pStyle w:val="Heading3"/>
       </w:pPr>
-      <w:bookmarkStart w:id="30" w:name="_Toc238500524"/>
+      <w:bookmarkStart w:id="28" w:name="_Toc238503177"/>
       <w:r>
         <w:lastRenderedPageBreak/>
-        <w:t>4.2.3 Use Case Diagram</w:t>
-      </w:r>
-      <w:bookmarkEnd w:id="30"/>
+        <w:t>Backend Layer Class Diagram</w:t>
+      </w:r>
+      <w:bookmarkEnd w:id="28"/>
     </w:p>
     <w:p>
       <w:pPr>
@@ -11509,10 +11514,10 @@
           <w:noProof/>
         </w:rPr>
         <w:drawing>
-          <wp:inline distT="0" distB="0" distL="0" distR="0" wp14:anchorId="212893A9" wp14:editId="5F278732">
+          <wp:inline distT="0" distB="0" distL="0" distR="0" wp14:anchorId="2B2A1F0A" wp14:editId="2BC8C1B6">
             <wp:extent cx="5943600" cy="3714750"/>
             <wp:effectExtent l="0" t="0" r="0" b="0"/>
-            <wp:docPr id="733159688" name="Picture 12"/>
+            <wp:docPr id="838496089" name="Picture 12"/>
             <wp:cNvGraphicFramePr>
               <a:graphicFrameLocks xmlns:a="http://schemas.openxmlformats.org/drawingml/2006/main" noChangeAspect="1"/>
             </wp:cNvGraphicFramePr>
@@ -11520,7 +11525,7 @@
               <a:graphicData uri="http://schemas.openxmlformats.org/drawingml/2006/picture">
                 <pic:pic xmlns:pic="http://schemas.openxmlformats.org/drawingml/2006/picture">
                   <pic:nvPicPr>
-                    <pic:cNvPr id="733159688" name=""/>
+                    <pic:cNvPr id="838496089" name=""/>
                     <pic:cNvPicPr/>
                   </pic:nvPicPr>
                   <pic:blipFill>
@@ -11562,14 +11567,384 @@
         <w:rPr>
           <w:sz w:val="20"/>
         </w:rPr>
-        <w:t>Figure 4.8 - Use Case Diagram</w:t>
+        <w:t>Figure 4.4 - Backend Layer Class Diagram</w:t>
+      </w:r>
+    </w:p>
+    <w:p>
+      <w:pPr>
+        <w:pStyle w:val="Heading3"/>
+      </w:pPr>
+      <w:bookmarkStart w:id="29" w:name="_Toc238503178"/>
+      <w:r>
+        <w:t>4.2.2 Sequence Diagrams</w:t>
+      </w:r>
+      <w:bookmarkEnd w:id="29"/>
+    </w:p>
+    <w:p>
+      <w:r>
+        <w:t>#### Login Sequence</w:t>
+      </w:r>
+    </w:p>
+    <w:p>
+      <w:pPr>
+        <w:jc w:val="center"/>
+      </w:pPr>
+      <w:r>
+        <w:rPr>
+          <w:noProof/>
+        </w:rPr>
+        <w:lastRenderedPageBreak/>
+        <w:drawing>
+          <wp:inline distT="0" distB="0" distL="0" distR="0" wp14:anchorId="026C6C51" wp14:editId="2BAD209C">
+            <wp:extent cx="5943600" cy="3714750"/>
+            <wp:effectExtent l="0" t="0" r="0" b="0"/>
+            <wp:docPr id="1866402450" name="Picture 13"/>
+            <wp:cNvGraphicFramePr>
+              <a:graphicFrameLocks xmlns:a="http://schemas.openxmlformats.org/drawingml/2006/main" noChangeAspect="1"/>
+            </wp:cNvGraphicFramePr>
+            <a:graphic xmlns:a="http://schemas.openxmlformats.org/drawingml/2006/main">
+              <a:graphicData uri="http://schemas.openxmlformats.org/drawingml/2006/picture">
+                <pic:pic xmlns:pic="http://schemas.openxmlformats.org/drawingml/2006/picture">
+                  <pic:nvPicPr>
+                    <pic:cNvPr id="1866402450" name=""/>
+                    <pic:cNvPicPr/>
+                  </pic:nvPicPr>
+                  <pic:blipFill>
+                    <a:blip r:embed="rId27" cstate="print">
+                      <a:extLst>
+                        <a:ext uri="{28A0092B-C50C-407E-A947-70E740481C1C}">
+                          <a14:useLocalDpi xmlns:a14="http://schemas.microsoft.com/office/drawing/2010/main" val="0"/>
+                        </a:ext>
+                      </a:extLst>
+                    </a:blip>
+                    <a:stretch>
+                      <a:fillRect/>
+                    </a:stretch>
+                  </pic:blipFill>
+                  <pic:spPr>
+                    <a:xfrm>
+                      <a:off x="0" y="0"/>
+                      <a:ext cx="5943600" cy="3714750"/>
+                    </a:xfrm>
+                    <a:prstGeom prst="rect">
+                      <a:avLst/>
+                    </a:prstGeom>
+                  </pic:spPr>
+                </pic:pic>
+              </a:graphicData>
+            </a:graphic>
+          </wp:inline>
+        </w:drawing>
+      </w:r>
+    </w:p>
+    <w:p>
+      <w:pPr>
+        <w:pStyle w:val="Caption"/>
+        <w:rPr>
+          <w:sz w:val="20"/>
+        </w:rPr>
+      </w:pPr>
+      <w:r>
+        <w:rPr>
+          <w:sz w:val="20"/>
+        </w:rPr>
+        <w:t>Figure 4.5 - Booking-to-Tenancy Sequence</w:t>
+      </w:r>
+    </w:p>
+    <w:p>
+      <w:r>
+        <w:t>#### Apartment Booking and Approval Sequence</w:t>
+      </w:r>
+    </w:p>
+    <w:p>
+      <w:pPr>
+        <w:jc w:val="center"/>
+      </w:pPr>
+      <w:r>
+        <w:rPr>
+          <w:noProof/>
+        </w:rPr>
+        <w:lastRenderedPageBreak/>
+        <w:drawing>
+          <wp:inline distT="0" distB="0" distL="0" distR="0" wp14:anchorId="6CCDA24F" wp14:editId="5A41DC4B">
+            <wp:extent cx="5943600" cy="3714750"/>
+            <wp:effectExtent l="0" t="0" r="0" b="0"/>
+            <wp:docPr id="2015417589" name="Picture 14"/>
+            <wp:cNvGraphicFramePr>
+              <a:graphicFrameLocks xmlns:a="http://schemas.openxmlformats.org/drawingml/2006/main" noChangeAspect="1"/>
+            </wp:cNvGraphicFramePr>
+            <a:graphic xmlns:a="http://schemas.openxmlformats.org/drawingml/2006/main">
+              <a:graphicData uri="http://schemas.openxmlformats.org/drawingml/2006/picture">
+                <pic:pic xmlns:pic="http://schemas.openxmlformats.org/drawingml/2006/picture">
+                  <pic:nvPicPr>
+                    <pic:cNvPr id="2015417589" name=""/>
+                    <pic:cNvPicPr/>
+                  </pic:nvPicPr>
+                  <pic:blipFill>
+                    <a:blip r:embed="rId28" cstate="print">
+                      <a:extLst>
+                        <a:ext uri="{28A0092B-C50C-407E-A947-70E740481C1C}">
+                          <a14:useLocalDpi xmlns:a14="http://schemas.microsoft.com/office/drawing/2010/main" val="0"/>
+                        </a:ext>
+                      </a:extLst>
+                    </a:blip>
+                    <a:stretch>
+                      <a:fillRect/>
+                    </a:stretch>
+                  </pic:blipFill>
+                  <pic:spPr>
+                    <a:xfrm>
+                      <a:off x="0" y="0"/>
+                      <a:ext cx="5943600" cy="3714750"/>
+                    </a:xfrm>
+                    <a:prstGeom prst="rect">
+                      <a:avLst/>
+                    </a:prstGeom>
+                  </pic:spPr>
+                </pic:pic>
+              </a:graphicData>
+            </a:graphic>
+          </wp:inline>
+        </w:drawing>
+      </w:r>
+    </w:p>
+    <w:p>
+      <w:pPr>
+        <w:pStyle w:val="Caption"/>
+        <w:rPr>
+          <w:sz w:val="20"/>
+        </w:rPr>
+      </w:pPr>
+      <w:r>
+        <w:rPr>
+          <w:sz w:val="20"/>
+        </w:rPr>
+        <w:t>Figure 4.6 - Payment Sequence</w:t>
+      </w:r>
+    </w:p>
+    <w:p>
+      <w:r>
+        <w:t>#### Verified Payment Sequence</w:t>
+      </w:r>
+    </w:p>
+    <w:p>
+      <w:pPr>
+        <w:jc w:val="center"/>
+      </w:pPr>
+      <w:r>
+        <w:rPr>
+          <w:noProof/>
+        </w:rPr>
+        <w:lastRenderedPageBreak/>
+        <w:drawing>
+          <wp:inline distT="0" distB="0" distL="0" distR="0" wp14:anchorId="16DDAC41" wp14:editId="1C35E293">
+            <wp:extent cx="5943600" cy="3714750"/>
+            <wp:effectExtent l="0" t="0" r="0" b="0"/>
+            <wp:docPr id="1839209133" name="Picture 15"/>
+            <wp:cNvGraphicFramePr>
+              <a:graphicFrameLocks xmlns:a="http://schemas.openxmlformats.org/drawingml/2006/main" noChangeAspect="1"/>
+            </wp:cNvGraphicFramePr>
+            <a:graphic xmlns:a="http://schemas.openxmlformats.org/drawingml/2006/main">
+              <a:graphicData uri="http://schemas.openxmlformats.org/drawingml/2006/picture">
+                <pic:pic xmlns:pic="http://schemas.openxmlformats.org/drawingml/2006/picture">
+                  <pic:nvPicPr>
+                    <pic:cNvPr id="1839209133" name=""/>
+                    <pic:cNvPicPr/>
+                  </pic:nvPicPr>
+                  <pic:blipFill>
+                    <a:blip r:embed="rId29" cstate="print">
+                      <a:extLst>
+                        <a:ext uri="{28A0092B-C50C-407E-A947-70E740481C1C}">
+                          <a14:useLocalDpi xmlns:a14="http://schemas.microsoft.com/office/drawing/2010/main" val="0"/>
+                        </a:ext>
+                      </a:extLst>
+                    </a:blip>
+                    <a:stretch>
+                      <a:fillRect/>
+                    </a:stretch>
+                  </pic:blipFill>
+                  <pic:spPr>
+                    <a:xfrm>
+                      <a:off x="0" y="0"/>
+                      <a:ext cx="5943600" cy="3714750"/>
+                    </a:xfrm>
+                    <a:prstGeom prst="rect">
+                      <a:avLst/>
+                    </a:prstGeom>
+                  </pic:spPr>
+                </pic:pic>
+              </a:graphicData>
+            </a:graphic>
+          </wp:inline>
+        </w:drawing>
+      </w:r>
+    </w:p>
+    <w:p>
+      <w:pPr>
+        <w:pStyle w:val="Caption"/>
+        <w:rPr>
+          <w:sz w:val="20"/>
+        </w:rPr>
+      </w:pPr>
+      <w:r>
+        <w:rPr>
+          <w:sz w:val="20"/>
+        </w:rPr>
+        <w:t>Figure 4.7 - Complaint and Maintenance Sequence</w:t>
+      </w:r>
+    </w:p>
+    <w:p>
+      <w:r>
+        <w:t>#### Real-Time Notification Sequence</w:t>
+      </w:r>
+    </w:p>
+    <w:p>
+      <w:pPr>
+        <w:jc w:val="center"/>
+      </w:pPr>
+      <w:r>
+        <w:rPr>
+          <w:noProof/>
+        </w:rPr>
+        <w:lastRenderedPageBreak/>
+        <w:drawing>
+          <wp:inline distT="0" distB="0" distL="0" distR="0" wp14:anchorId="1AD969D2" wp14:editId="683D8C22">
+            <wp:extent cx="5943600" cy="3714750"/>
+            <wp:effectExtent l="0" t="0" r="0" b="0"/>
+            <wp:docPr id="1668642574" name="Picture 16"/>
+            <wp:cNvGraphicFramePr>
+              <a:graphicFrameLocks xmlns:a="http://schemas.openxmlformats.org/drawingml/2006/main" noChangeAspect="1"/>
+            </wp:cNvGraphicFramePr>
+            <a:graphic xmlns:a="http://schemas.openxmlformats.org/drawingml/2006/main">
+              <a:graphicData uri="http://schemas.openxmlformats.org/drawingml/2006/picture">
+                <pic:pic xmlns:pic="http://schemas.openxmlformats.org/drawingml/2006/picture">
+                  <pic:nvPicPr>
+                    <pic:cNvPr id="1668642574" name=""/>
+                    <pic:cNvPicPr/>
+                  </pic:nvPicPr>
+                  <pic:blipFill>
+                    <a:blip r:embed="rId30" cstate="print">
+                      <a:extLst>
+                        <a:ext uri="{28A0092B-C50C-407E-A947-70E740481C1C}">
+                          <a14:useLocalDpi xmlns:a14="http://schemas.microsoft.com/office/drawing/2010/main" val="0"/>
+                        </a:ext>
+                      </a:extLst>
+                    </a:blip>
+                    <a:stretch>
+                      <a:fillRect/>
+                    </a:stretch>
+                  </pic:blipFill>
+                  <pic:spPr>
+                    <a:xfrm>
+                      <a:off x="0" y="0"/>
+                      <a:ext cx="5943600" cy="3714750"/>
+                    </a:xfrm>
+                    <a:prstGeom prst="rect">
+                      <a:avLst/>
+                    </a:prstGeom>
+                  </pic:spPr>
+                </pic:pic>
+              </a:graphicData>
+            </a:graphic>
+          </wp:inline>
+        </w:drawing>
+      </w:r>
+    </w:p>
+    <w:p>
+      <w:pPr>
+        <w:pStyle w:val="Caption"/>
+        <w:rPr>
+          <w:sz w:val="20"/>
+        </w:rPr>
+      </w:pPr>
+      <w:r>
+        <w:rPr>
+          <w:sz w:val="20"/>
+        </w:rPr>
+        <w:t>Figure 4.8 - Deposit Dispute Settlement Sequence</w:t>
+      </w:r>
+    </w:p>
+    <w:p>
+      <w:pPr>
+        <w:pStyle w:val="Heading3"/>
+      </w:pPr>
+      <w:bookmarkStart w:id="30" w:name="_Toc238503179"/>
+      <w:r>
+        <w:lastRenderedPageBreak/>
+        <w:t>4.2.3 Use Case Diagram</w:t>
+      </w:r>
+      <w:bookmarkEnd w:id="30"/>
+    </w:p>
+    <w:p>
+      <w:pPr>
+        <w:jc w:val="center"/>
+      </w:pPr>
+      <w:r>
+        <w:rPr>
+          <w:noProof/>
+        </w:rPr>
+        <w:drawing>
+          <wp:inline distT="0" distB="0" distL="0" distR="0" wp14:anchorId="34BA1EC7" wp14:editId="7D881293">
+            <wp:extent cx="5943600" cy="3714750"/>
+            <wp:effectExtent l="0" t="0" r="0" b="0"/>
+            <wp:docPr id="1385443249" name="Picture 17"/>
+            <wp:cNvGraphicFramePr>
+              <a:graphicFrameLocks xmlns:a="http://schemas.openxmlformats.org/drawingml/2006/main" noChangeAspect="1"/>
+            </wp:cNvGraphicFramePr>
+            <a:graphic xmlns:a="http://schemas.openxmlformats.org/drawingml/2006/main">
+              <a:graphicData uri="http://schemas.openxmlformats.org/drawingml/2006/picture">
+                <pic:pic xmlns:pic="http://schemas.openxmlformats.org/drawingml/2006/picture">
+                  <pic:nvPicPr>
+                    <pic:cNvPr id="1385443249" name=""/>
+                    <pic:cNvPicPr/>
+                  </pic:nvPicPr>
+                  <pic:blipFill>
+                    <a:blip r:embed="rId31" cstate="print">
+                      <a:extLst>
+                        <a:ext uri="{28A0092B-C50C-407E-A947-70E740481C1C}">
+                          <a14:useLocalDpi xmlns:a14="http://schemas.microsoft.com/office/drawing/2010/main" val="0"/>
+                        </a:ext>
+                      </a:extLst>
+                    </a:blip>
+                    <a:stretch>
+                      <a:fillRect/>
+                    </a:stretch>
+                  </pic:blipFill>
+                  <pic:spPr>
+                    <a:xfrm>
+                      <a:off x="0" y="0"/>
+                      <a:ext cx="5943600" cy="3714750"/>
+                    </a:xfrm>
+                    <a:prstGeom prst="rect">
+                      <a:avLst/>
+                    </a:prstGeom>
+                  </pic:spPr>
+                </pic:pic>
+              </a:graphicData>
+            </a:graphic>
+          </wp:inline>
+        </w:drawing>
+      </w:r>
+    </w:p>
+    <w:p>
+      <w:pPr>
+        <w:pStyle w:val="Caption"/>
+        <w:rPr>
+          <w:sz w:val="20"/>
+        </w:rPr>
+      </w:pPr>
+      <w:r>
+        <w:rPr>
+          <w:sz w:val="20"/>
+        </w:rPr>
+        <w:t>Figure 4.9 - Use Case Diagram</w:t>
       </w:r>
     </w:p>
     <w:p>
       <w:pPr>
         <w:pStyle w:val="Heading2"/>
       </w:pPr>
-      <w:bookmarkStart w:id="31" w:name="_Toc238500525"/>
+      <w:bookmarkStart w:id="31" w:name="_Toc238503180"/>
       <w:r>
         <w:t>4.3 Database Design</w:t>
       </w:r>
@@ -12764,7 +13139,7 @@
       <w:pPr>
         <w:pStyle w:val="Heading3"/>
       </w:pPr>
-      <w:bookmarkStart w:id="32" w:name="_Toc238500526"/>
+      <w:bookmarkStart w:id="32" w:name="_Toc238503181"/>
       <w:r>
         <w:t>Normalization Decisions</w:t>
       </w:r>
@@ -12779,7 +13154,7 @@
       <w:pPr>
         <w:pStyle w:val="Heading3"/>
       </w:pPr>
-      <w:bookmarkStart w:id="33" w:name="_Toc238500527"/>
+      <w:bookmarkStart w:id="33" w:name="_Toc238503182"/>
       <w:r>
         <w:t>Data Integrity Rules</w:t>
       </w:r>
@@ -12845,7 +13220,7 @@
       <w:pPr>
         <w:pStyle w:val="Heading2"/>
       </w:pPr>
-      <w:bookmarkStart w:id="34" w:name="_Toc238500528"/>
+      <w:bookmarkStart w:id="34" w:name="_Toc238503183"/>
       <w:r>
         <w:t>4.4 Input Design</w:t>
       </w:r>
@@ -12946,7 +13321,7 @@
       <w:pPr>
         <w:pStyle w:val="Heading2"/>
       </w:pPr>
-      <w:bookmarkStart w:id="35" w:name="_Toc238500529"/>
+      <w:bookmarkStart w:id="35" w:name="_Toc238503184"/>
       <w:r>
         <w:t>4.5 Output Design</w:t>
       </w:r>
@@ -13050,7 +13425,7 @@
       <w:pPr>
         <w:pStyle w:val="Heading1"/>
       </w:pPr>
-      <w:bookmarkStart w:id="36" w:name="_Toc238500530"/>
+      <w:bookmarkStart w:id="36" w:name="_Toc238503185"/>
       <w:r>
         <w:lastRenderedPageBreak/>
         <w:t>5. SYSTEM IMPLEMENTATION OVERVIEW</w:t>
@@ -13066,7 +13441,7 @@
       <w:pPr>
         <w:pStyle w:val="Heading2"/>
       </w:pPr>
-      <w:bookmarkStart w:id="37" w:name="_Toc238500531"/>
+      <w:bookmarkStart w:id="37" w:name="_Toc238503186"/>
       <w:r>
         <w:t>5.1 Main Modules</w:t>
       </w:r>
@@ -13076,7 +13451,7 @@
       <w:pPr>
         <w:pStyle w:val="Heading3"/>
       </w:pPr>
-      <w:bookmarkStart w:id="38" w:name="_Toc238500532"/>
+      <w:bookmarkStart w:id="38" w:name="_Toc238503187"/>
       <w:r>
         <w:t>Authentication and Profile</w:t>
       </w:r>
@@ -13091,7 +13466,7 @@
       <w:pPr>
         <w:pStyle w:val="Heading3"/>
       </w:pPr>
-      <w:bookmarkStart w:id="39" w:name="_Toc238500533"/>
+      <w:bookmarkStart w:id="39" w:name="_Toc238503188"/>
       <w:r>
         <w:t>Organization and User Administration</w:t>
       </w:r>
@@ -13106,7 +13481,7 @@
       <w:pPr>
         <w:pStyle w:val="Heading3"/>
       </w:pPr>
-      <w:bookmarkStart w:id="40" w:name="_Toc238500534"/>
+      <w:bookmarkStart w:id="40" w:name="_Toc238503189"/>
       <w:r>
         <w:t>Property, Building and Unit Management</w:t>
       </w:r>
@@ -13121,7 +13496,7 @@
       <w:pPr>
         <w:pStyle w:val="Heading3"/>
       </w:pPr>
-      <w:bookmarkStart w:id="41" w:name="_Toc238500535"/>
+      <w:bookmarkStart w:id="41" w:name="_Toc238503190"/>
       <w:r>
         <w:t>Tenant and Agreement Management</w:t>
       </w:r>
@@ -13136,7 +13511,7 @@
       <w:pPr>
         <w:pStyle w:val="Heading3"/>
       </w:pPr>
-      <w:bookmarkStart w:id="42" w:name="_Toc238500536"/>
+      <w:bookmarkStart w:id="42" w:name="_Toc238503191"/>
       <w:r>
         <w:t>Invoice and Payment Management</w:t>
       </w:r>
@@ -13155,7 +13530,7 @@
       <w:pPr>
         <w:pStyle w:val="Heading3"/>
       </w:pPr>
-      <w:bookmarkStart w:id="43" w:name="_Toc238500537"/>
+      <w:bookmarkStart w:id="43" w:name="_Toc238503192"/>
       <w:r>
         <w:t>Apartment Booking and Approvals</w:t>
       </w:r>
@@ -13170,7 +13545,7 @@
       <w:pPr>
         <w:pStyle w:val="Heading3"/>
       </w:pPr>
-      <w:bookmarkStart w:id="44" w:name="_Toc238500538"/>
+      <w:bookmarkStart w:id="44" w:name="_Toc238503193"/>
       <w:r>
         <w:t>Complaints and Maintenance</w:t>
       </w:r>
@@ -13185,7 +13560,7 @@
       <w:pPr>
         <w:pStyle w:val="Heading3"/>
       </w:pPr>
-      <w:bookmarkStart w:id="45" w:name="_Toc238500539"/>
+      <w:bookmarkStart w:id="45" w:name="_Toc238503194"/>
       <w:r>
         <w:t>Deposit Disputes</w:t>
       </w:r>
@@ -13200,7 +13575,7 @@
       <w:pPr>
         <w:pStyle w:val="Heading3"/>
       </w:pPr>
-      <w:bookmarkStart w:id="46" w:name="_Toc238500540"/>
+      <w:bookmarkStart w:id="46" w:name="_Toc238503195"/>
       <w:r>
         <w:t>Rent Increase Management</w:t>
       </w:r>
@@ -13215,7 +13590,7 @@
       <w:pPr>
         <w:pStyle w:val="Heading3"/>
       </w:pPr>
-      <w:bookmarkStart w:id="47" w:name="_Toc238500541"/>
+      <w:bookmarkStart w:id="47" w:name="_Toc238503196"/>
       <w:r>
         <w:t>Notifications</w:t>
       </w:r>
@@ -13230,7 +13605,7 @@
       <w:pPr>
         <w:pStyle w:val="Heading3"/>
       </w:pPr>
-      <w:bookmarkStart w:id="48" w:name="_Toc238500542"/>
+      <w:bookmarkStart w:id="48" w:name="_Toc238503197"/>
       <w:r>
         <w:t>AI Assistant</w:t>
       </w:r>
@@ -13245,7 +13620,7 @@
       <w:pPr>
         <w:pStyle w:val="Heading3"/>
       </w:pPr>
-      <w:bookmarkStart w:id="49" w:name="_Toc238500543"/>
+      <w:bookmarkStart w:id="49" w:name="_Toc238503198"/>
       <w:r>
         <w:lastRenderedPageBreak/>
         <w:t>User Interface Features</w:t>
@@ -13320,7 +13695,7 @@
       <w:pPr>
         <w:pStyle w:val="Heading2"/>
       </w:pPr>
-      <w:bookmarkStart w:id="50" w:name="_Toc238500544"/>
+      <w:bookmarkStart w:id="50" w:name="_Toc238503199"/>
       <w:r>
         <w:t>5.2 Screenshots</w:t>
       </w:r>
@@ -14837,7 +15212,7 @@
       <w:pPr>
         <w:pStyle w:val="Heading1"/>
       </w:pPr>
-      <w:bookmarkStart w:id="51" w:name="_Toc238500545"/>
+      <w:bookmarkStart w:id="51" w:name="_Toc238503200"/>
       <w:r>
         <w:lastRenderedPageBreak/>
         <w:t>6. TESTING</w:t>
@@ -14853,7 +15228,7 @@
       <w:pPr>
         <w:pStyle w:val="Heading2"/>
       </w:pPr>
-      <w:bookmarkStart w:id="52" w:name="_Toc238500546"/>
+      <w:bookmarkStart w:id="52" w:name="_Toc238503201"/>
       <w:r>
         <w:t>6.1 Test Case 1: FORM VALIDATION</w:t>
       </w:r>
@@ -15808,7 +16183,7 @@
       <w:pPr>
         <w:pStyle w:val="Heading2"/>
       </w:pPr>
-      <w:bookmarkStart w:id="53" w:name="_Toc238500547"/>
+      <w:bookmarkStart w:id="53" w:name="_Toc238503202"/>
       <w:r>
         <w:t>6.2 Test Case 2: Authentication and Authorization</w:t>
       </w:r>
@@ -16705,7 +17080,7 @@
       <w:pPr>
         <w:pStyle w:val="Heading2"/>
       </w:pPr>
-      <w:bookmarkStart w:id="54" w:name="_Toc238500548"/>
+      <w:bookmarkStart w:id="54" w:name="_Toc238503203"/>
       <w:r>
         <w:t>6.3 Test Case 3: Payment Processing</w:t>
       </w:r>
@@ -17601,7 +17976,7 @@
       <w:pPr>
         <w:pStyle w:val="Heading2"/>
       </w:pPr>
-      <w:bookmarkStart w:id="55" w:name="_Toc238500549"/>
+      <w:bookmarkStart w:id="55" w:name="_Toc238503204"/>
       <w:r>
         <w:t>6.4 Test Case 4: Tenant Data Isolation</w:t>
       </w:r>
@@ -17962,7 +18337,7 @@
       <w:pPr>
         <w:pStyle w:val="Heading2"/>
       </w:pPr>
-      <w:bookmarkStart w:id="56" w:name="_Toc238500550"/>
+      <w:bookmarkStart w:id="56" w:name="_Toc238503205"/>
       <w:r>
         <w:t>6.5 Test Case 5: Approval Workflow</w:t>
       </w:r>
@@ -18318,7 +18693,7 @@
       <w:pPr>
         <w:pStyle w:val="Heading3"/>
       </w:pPr>
-      <w:bookmarkStart w:id="57" w:name="_Toc238500551"/>
+      <w:bookmarkStart w:id="57" w:name="_Toc238503206"/>
       <w:r>
         <w:t>Test Summary</w:t>
       </w:r>
@@ -18747,7 +19122,7 @@
       <w:pPr>
         <w:pStyle w:val="Heading1"/>
       </w:pPr>
-      <w:bookmarkStart w:id="58" w:name="_Toc238500552"/>
+      <w:bookmarkStart w:id="58" w:name="_Toc238503207"/>
       <w:r>
         <w:lastRenderedPageBreak/>
         <w:t>7. APPENDICES</w:t>
@@ -18758,7 +19133,7 @@
       <w:pPr>
         <w:pStyle w:val="Heading2"/>
       </w:pPr>
-      <w:bookmarkStart w:id="59" w:name="_Toc238500553"/>
+      <w:bookmarkStart w:id="59" w:name="_Toc238503208"/>
       <w:r>
         <w:t>Appendix A: Important API Routes</w:t>
       </w:r>
@@ -19330,7 +19705,7 @@
       <w:pPr>
         <w:pStyle w:val="Heading2"/>
       </w:pPr>
-      <w:bookmarkStart w:id="60" w:name="_Toc238500554"/>
+      <w:bookmarkStart w:id="60" w:name="_Toc238503209"/>
       <w:r>
         <w:t>Appendix B: Status Enumerations</w:t>
       </w:r>
@@ -19412,7 +19787,7 @@
       <w:pPr>
         <w:pStyle w:val="Heading2"/>
       </w:pPr>
-      <w:bookmarkStart w:id="61" w:name="_Toc238500555"/>
+      <w:bookmarkStart w:id="61" w:name="_Toc238503210"/>
       <w:r>
         <w:t>Appendix C: Environment Variables</w:t>
       </w:r>
@@ -19427,7 +19802,7 @@
       <w:pPr>
         <w:pStyle w:val="Heading2"/>
       </w:pPr>
-      <w:bookmarkStart w:id="62" w:name="_Toc238500556"/>
+      <w:bookmarkStart w:id="62" w:name="_Toc238503211"/>
       <w:r>
         <w:lastRenderedPageBreak/>
         <w:t>Appendix D: Local Execution</w:t>
@@ -19443,7 +19818,7 @@
       <w:pPr>
         <w:pStyle w:val="Heading2"/>
       </w:pPr>
-      <w:bookmarkStart w:id="63" w:name="_Toc238500557"/>
+      <w:bookmarkStart w:id="63" w:name="_Toc238503212"/>
       <w:r>
         <w:t>Appendix E: Suggested Future Enhancements</w:t>
       </w:r>
@@ -19542,7 +19917,7 @@
       <w:pPr>
         <w:pStyle w:val="Heading1"/>
       </w:pPr>
-      <w:bookmarkStart w:id="64" w:name="_Toc238500558"/>
+      <w:bookmarkStart w:id="64" w:name="_Toc238503213"/>
       <w:r>
         <w:lastRenderedPageBreak/>
         <w:t>8. REFERENCES</w:t>
@@ -19665,7 +20040,7 @@
       <w:pPr>
         <w:pStyle w:val="Heading2"/>
       </w:pPr>
-      <w:bookmarkStart w:id="65" w:name="_Toc238500559"/>
+      <w:bookmarkStart w:id="65" w:name="_Toc238503214"/>
       <w:r>
         <w:t>Conclusion</w:t>
       </w:r>
@@ -19790,7 +20165,7 @@
         <w:rStyle w:val="PageNumber"/>
         <w:noProof/>
       </w:rPr>
-      <w:t>20</w:t>
+      <w:t>46</w:t>
     </w:r>
     <w:r>
       <w:rPr>
@@ -19938,7 +20313,7 @@
   <w:abstractNum w:abstractNumId="0" w15:restartNumberingAfterBreak="0">
     <w:nsid w:val="FFFFFF88"/>
     <w:multiLevelType w:val="singleLevel"/>
-    <w:tmpl w:val="83CE09FC"/>
+    <w:tmpl w:val="473A0000"/>
     <w:lvl w:ilvl="0">
       <w:start w:val="1"/>
       <w:numFmt w:val="decimal"/>
@@ -19956,7 +20331,7 @@
   <w:abstractNum w:abstractNumId="1" w15:restartNumberingAfterBreak="0">
     <w:nsid w:val="FFFFFF89"/>
     <w:multiLevelType w:val="singleLevel"/>
-    <w:tmpl w:val="93EA08D6"/>
+    <w:tmpl w:val="25EE85EE"/>
     <w:lvl w:ilvl="0">
       <w:start w:val="1"/>
       <w:numFmt w:val="bullet"/>
@@ -19974,10 +20349,10 @@
       </w:rPr>
     </w:lvl>
   </w:abstractNum>
-  <w:num w:numId="1" w16cid:durableId="926040142">
+  <w:num w:numId="1" w16cid:durableId="419788711">
     <w:abstractNumId w:val="0"/>
   </w:num>
-  <w:num w:numId="2" w16cid:durableId="1324359179">
+  <w:num w:numId="2" w16cid:durableId="1991514013">
     <w:abstractNumId w:val="1"/>
   </w:num>
 </w:numbering>
@@ -20421,7 +20796,7 @@
     <w:uiPriority w:val="9"/>
     <w:unhideWhenUsed/>
     <w:qFormat/>
-    <w:rsid w:val="008B413F"/>
+    <w:rsid w:val="0091168F"/>
     <w:pPr>
       <w:keepNext/>
       <w:keepLines/>
@@ -20444,7 +20819,7 @@
     <w:uiPriority w:val="9"/>
     <w:unhideWhenUsed/>
     <w:qFormat/>
-    <w:rsid w:val="008B413F"/>
+    <w:rsid w:val="0091168F"/>
     <w:pPr>
       <w:keepNext/>
       <w:keepLines/>
@@ -20560,7 +20935,7 @@
     <w:link w:val="TitleChar"/>
     <w:uiPriority w:val="10"/>
     <w:qFormat/>
-    <w:rsid w:val="008B413F"/>
+    <w:rsid w:val="0091168F"/>
     <w:pPr>
       <w:spacing w:after="0" w:line="240" w:lineRule="auto"/>
       <w:contextualSpacing/>
@@ -20580,7 +20955,7 @@
     <w:basedOn w:val="DefaultParagraphFont"/>
     <w:link w:val="Title"/>
     <w:uiPriority w:val="10"/>
-    <w:rsid w:val="008B413F"/>
+    <w:rsid w:val="0091168F"/>
     <w:rPr>
       <w:rFonts w:ascii="Times New Roman" w:eastAsiaTheme="majorEastAsia" w:hAnsi="Times New Roman" w:cs="Times New Roman"/>
       <w:b/>
@@ -20597,7 +20972,7 @@
     <w:basedOn w:val="DefaultParagraphFont"/>
     <w:link w:val="Heading2"/>
     <w:uiPriority w:val="9"/>
-    <w:rsid w:val="008B413F"/>
+    <w:rsid w:val="0091168F"/>
     <w:rPr>
       <w:rFonts w:ascii="Times New Roman" w:eastAsiaTheme="majorEastAsia" w:hAnsi="Times New Roman" w:cs="Times New Roman"/>
       <w:b/>
@@ -20612,7 +20987,7 @@
     <w:basedOn w:val="DefaultParagraphFont"/>
     <w:link w:val="Heading3"/>
     <w:uiPriority w:val="9"/>
-    <w:rsid w:val="008B413F"/>
+    <w:rsid w:val="0091168F"/>
     <w:rPr>
       <w:rFonts w:ascii="Times New Roman" w:eastAsiaTheme="majorEastAsia" w:hAnsi="Times New Roman" w:cs="Times New Roman"/>
       <w:b/>
@@ -20629,7 +21004,7 @@
     <w:autoRedefine/>
     <w:uiPriority w:val="39"/>
     <w:unhideWhenUsed/>
-    <w:rsid w:val="008B413F"/>
+    <w:rsid w:val="0091168F"/>
     <w:pPr>
       <w:spacing w:after="100"/>
     </w:pPr>
@@ -20639,7 +21014,7 @@
     <w:basedOn w:val="Normal"/>
     <w:uiPriority w:val="99"/>
     <w:unhideWhenUsed/>
-    <w:rsid w:val="008B413F"/>
+    <w:rsid w:val="0091168F"/>
     <w:pPr>
       <w:numPr>
         <w:numId w:val="1"/>
@@ -20652,7 +21027,7 @@
     <w:basedOn w:val="Normal"/>
     <w:uiPriority w:val="99"/>
     <w:unhideWhenUsed/>
-    <w:rsid w:val="008B413F"/>
+    <w:rsid w:val="0091168F"/>
     <w:pPr>
       <w:numPr>
         <w:numId w:val="2"/>
@@ -20667,7 +21042,7 @@
     <w:uiPriority w:val="35"/>
     <w:unhideWhenUsed/>
     <w:qFormat/>
-    <w:rsid w:val="008B413F"/>
+    <w:rsid w:val="0091168F"/>
     <w:pPr>
       <w:spacing w:after="200" w:line="240" w:lineRule="auto"/>
     </w:pPr>
@@ -20685,7 +21060,7 @@
     <w:uiPriority w:val="99"/>
     <w:semiHidden/>
     <w:unhideWhenUsed/>
-    <w:rsid w:val="008B413F"/>
+    <w:rsid w:val="0091168F"/>
   </w:style>
   <w:style w:type="paragraph" w:styleId="TOC2">
     <w:name w:val="toc 2"/>
@@ -20694,7 +21069,7 @@
     <w:autoRedefine/>
     <w:uiPriority w:val="39"/>
     <w:unhideWhenUsed/>
-    <w:rsid w:val="008B413F"/>
+    <w:rsid w:val="0091168F"/>
     <w:pPr>
       <w:spacing w:after="100"/>
       <w:ind w:left="240"/>
@@ -20707,7 +21082,7 @@
     <w:autoRedefine/>
     <w:uiPriority w:val="39"/>
     <w:unhideWhenUsed/>
-    <w:rsid w:val="008B413F"/>
+    <w:rsid w:val="0091168F"/>
     <w:pPr>
       <w:spacing w:after="100"/>
       <w:ind w:left="480"/>

</xml_diff>